<commit_message>
docs(scope): restrict project to base game and document Git workflow
</commit_message>
<xml_diff>
--- a/docs/export/01_TECHSTACK.docx
+++ b/docs/export/01_TECHSTACK.docx
@@ -10,7 +10,7 @@
         <w:rPr>
           <w:color w:val="8A6D1E"/>
         </w:rPr>
-        <w:t>Index Beast — Techstack (v1.2)</w:t>
+        <w:t>Index Beast — Techstack (v1.3)</w:t>
       </w:r>
     </w:p>
     <w:tbl>
@@ -87,6 +87,44 @@
                 <w:sz w:val="19"/>
               </w:rPr>
               <w:t>Đã chốt — 2026-10-17</w:t>
+            </w:r>
+          </w:p>
+        </w:tc>
+      </w:tr>
+      <w:tr>
+        <w:tc>
+          <w:tcPr>
+            <w:tcW w:type="dxa" w:w="4320"/>
+          </w:tcPr>
+          <w:p>
+            <w:r>
+              <w:rPr>
+                <w:sz w:val="19"/>
+              </w:rPr>
+            </w:r>
+            <w:r>
+              <w:rPr>
+                <w:sz w:val="19"/>
+              </w:rPr>
+              <w:t>Phạm vi</w:t>
+            </w:r>
+          </w:p>
+        </w:tc>
+        <w:tc>
+          <w:tcPr>
+            <w:tcW w:type="dxa" w:w="4320"/>
+          </w:tcPr>
+          <w:p>
+            <w:r>
+              <w:rPr>
+                <w:sz w:val="19"/>
+              </w:rPr>
+            </w:r>
+            <w:r>
+              <w:rPr>
+                <w:sz w:val="19"/>
+              </w:rPr>
+              <w:t>Chỉ lore Elden Ring base game; loại trừ mọi DLC và Elden Ring Nightreign</w:t>
             </w:r>
           </w:p>
         </w:tc>
@@ -4101,7 +4139,7 @@
               <w:rPr>
                 <w:sz w:val="19"/>
               </w:rPr>
-              <w:t>Nguồn chính: base game + SotE</w:t>
+              <w:t>Nguồn chính: chỉ lore Elden Ring base game</w:t>
             </w:r>
           </w:p>
         </w:tc>
@@ -4238,6 +4276,21 @@
       </w:tr>
     </w:tbl>
     <w:p/>
+    <w:p>
+      <w:r>
+        <w:t>Chỉ thu thập và index nội dung base game (</w:t>
+      </w:r>
+      <w:r>
+        <w:rPr>
+          <w:rFonts w:ascii="Consolas" w:hAnsi="Consolas"/>
+          <w:sz w:val="19"/>
+        </w:rPr>
+        <w:t>game_scope=base</w:t>
+      </w:r>
+      <w:r>
+        <w:t>). Loại các trang/section DLC và Nightreign, kể cả khi cùng domain wiki.gg; tìm web dự phòng cũng phải áp dụng bộ lọc phạm vi này.</w:t>
+      </w:r>
+    </w:p>
     <w:p>
       <w:r>
         <w:t>Không crawl Fandom và Fextralife. Giới hạn crawl ≤ 1 request/giây, User-Agent có email liên hệ.</w:t>
@@ -4810,7 +4863,7 @@
               <w:rPr>
                 <w:sz w:val="19"/>
               </w:rPr>
-              <w:t>Phạm vi lore: base game + SotE</w:t>
+              <w:t>Chỉ lore Elden Ring base game; loại trừ mọi DLC và Elden Ring Nightreign</w:t>
             </w:r>
           </w:p>
         </w:tc>
@@ -4828,7 +4881,7 @@
               <w:rPr>
                 <w:sz w:val="19"/>
               </w:rPr>
-              <w:t>Đề xuất</w:t>
+              <w:t>Chốt theo yêu cầu nhóm</w:t>
             </w:r>
           </w:p>
         </w:tc>

</xml_diff>

<commit_message>
docs(scope): simplify project scope to base game
</commit_message>
<xml_diff>
--- a/docs/export/01_TECHSTACK.docx
+++ b/docs/export/01_TECHSTACK.docx
@@ -124,7 +124,7 @@
               <w:rPr>
                 <w:sz w:val="19"/>
               </w:rPr>
-              <w:t>Chỉ lore Elden Ring base game; loại trừ mọi DLC và Elden Ring Nightreign</w:t>
+              <w:t>Lore Elden Ring base game</w:t>
             </w:r>
           </w:p>
         </w:tc>
@@ -4278,7 +4278,7 @@
     <w:p/>
     <w:p>
       <w:r>
-        <w:t>Chỉ thu thập và index nội dung base game (</w:t>
+        <w:t>Thu thập và index lore base game (</w:t>
       </w:r>
       <w:r>
         <w:rPr>
@@ -4288,7 +4288,7 @@
         <w:t>game_scope=base</w:t>
       </w:r>
       <w:r>
-        <w:t>). Loại các trang/section DLC và Nightreign, kể cả khi cùng domain wiki.gg; tìm web dự phòng cũng phải áp dụng bộ lọc phạm vi này.</w:t>
+        <w:t>); áp dụng phạm vi này cho cả web fallback.</w:t>
       </w:r>
     </w:p>
     <w:p>
@@ -4863,7 +4863,7 @@
               <w:rPr>
                 <w:sz w:val="19"/>
               </w:rPr>
-              <w:t>Chỉ lore Elden Ring base game; loại trừ mọi DLC và Elden Ring Nightreign</w:t>
+              <w:t>Phạm vi lore: Elden Ring base game</w:t>
             </w:r>
           </w:p>
         </w:tc>
@@ -4881,7 +4881,7 @@
               <w:rPr>
                 <w:sz w:val="19"/>
               </w:rPr>
-              <w:t>Chốt theo yêu cầu nhóm</w:t>
+              <w:t>Chấp nhận</w:t>
             </w:r>
           </w:p>
         </w:tc>

</xml_diff>

<commit_message>
docs(export): add export_docx script and update docx exports
</commit_message>
<xml_diff>
--- a/docs/export/01_TECHSTACK.docx
+++ b/docs/export/01_TECHSTACK.docx
@@ -20,16 +20,19 @@
         <w:tblLook w:firstColumn="1" w:firstRow="1" w:lastColumn="0" w:lastRow="0" w:noHBand="0" w:noVBand="1" w:val="04A0"/>
       </w:tblPr>
       <w:tblGrid>
-        <w:gridCol w:w="4320"/>
-        <w:gridCol w:w="4320"/>
+        <w:gridCol w:w="4680"/>
+        <w:gridCol w:w="4680"/>
       </w:tblGrid>
       <w:tr>
         <w:tc>
           <w:tcPr>
-            <w:tcW w:type="dxa" w:w="4320"/>
+            <w:tcW w:type="dxa" w:w="4680"/>
             <w:shd w:val="clear" w:color="auto" w:fill="D9C48A"/>
           </w:tcPr>
           <w:p>
+            <w:pPr>
+              <w:spacing w:before="60" w:after="60"/>
+            </w:pPr>
             <w:r>
               <w:rPr>
                 <w:b/>
@@ -40,10 +43,13 @@
         </w:tc>
         <w:tc>
           <w:tcPr>
-            <w:tcW w:type="dxa" w:w="4320"/>
+            <w:tcW w:type="dxa" w:w="4680"/>
             <w:shd w:val="clear" w:color="auto" w:fill="D9C48A"/>
           </w:tcPr>
           <w:p>
+            <w:pPr>
+              <w:spacing w:before="60" w:after="60"/>
+            </w:pPr>
             <w:r>
               <w:rPr>
                 <w:b/>
@@ -56,9 +62,12 @@
       <w:tr>
         <w:tc>
           <w:tcPr>
-            <w:tcW w:type="dxa" w:w="4320"/>
+            <w:tcW w:type="dxa" w:w="4680"/>
           </w:tcPr>
           <w:p>
+            <w:pPr>
+              <w:spacing w:before="40" w:after="40"/>
+            </w:pPr>
             <w:r>
               <w:rPr>
                 <w:sz w:val="19"/>
@@ -74,9 +83,12 @@
         </w:tc>
         <w:tc>
           <w:tcPr>
-            <w:tcW w:type="dxa" w:w="4320"/>
+            <w:tcW w:type="dxa" w:w="4680"/>
           </w:tcPr>
           <w:p>
+            <w:pPr>
+              <w:spacing w:before="40" w:after="40"/>
+            </w:pPr>
             <w:r>
               <w:rPr>
                 <w:sz w:val="19"/>
@@ -94,9 +106,12 @@
       <w:tr>
         <w:tc>
           <w:tcPr>
-            <w:tcW w:type="dxa" w:w="4320"/>
+            <w:tcW w:type="dxa" w:w="4680"/>
           </w:tcPr>
           <w:p>
+            <w:pPr>
+              <w:spacing w:before="40" w:after="40"/>
+            </w:pPr>
             <w:r>
               <w:rPr>
                 <w:sz w:val="19"/>
@@ -112,9 +127,12 @@
         </w:tc>
         <w:tc>
           <w:tcPr>
-            <w:tcW w:type="dxa" w:w="4320"/>
+            <w:tcW w:type="dxa" w:w="4680"/>
           </w:tcPr>
           <w:p>
+            <w:pPr>
+              <w:spacing w:before="40" w:after="40"/>
+            </w:pPr>
             <w:r>
               <w:rPr>
                 <w:sz w:val="19"/>
@@ -132,9 +150,12 @@
       <w:tr>
         <w:tc>
           <w:tcPr>
-            <w:tcW w:type="dxa" w:w="4320"/>
+            <w:tcW w:type="dxa" w:w="4680"/>
           </w:tcPr>
           <w:p>
+            <w:pPr>
+              <w:spacing w:before="40" w:after="40"/>
+            </w:pPr>
             <w:r>
               <w:rPr>
                 <w:sz w:val="19"/>
@@ -150,9 +171,12 @@
         </w:tc>
         <w:tc>
           <w:tcPr>
-            <w:tcW w:type="dxa" w:w="4320"/>
+            <w:tcW w:type="dxa" w:w="4680"/>
           </w:tcPr>
           <w:p>
+            <w:pPr>
+              <w:spacing w:before="40" w:after="40"/>
+            </w:pPr>
             <w:r>
               <w:rPr>
                 <w:sz w:val="19"/>
@@ -170,9 +194,12 @@
       <w:tr>
         <w:tc>
           <w:tcPr>
-            <w:tcW w:type="dxa" w:w="4320"/>
+            <w:tcW w:type="dxa" w:w="4680"/>
           </w:tcPr>
           <w:p>
+            <w:pPr>
+              <w:spacing w:before="40" w:after="40"/>
+            </w:pPr>
             <w:r>
               <w:rPr>
                 <w:sz w:val="19"/>
@@ -188,9 +215,12 @@
         </w:tc>
         <w:tc>
           <w:tcPr>
-            <w:tcW w:type="dxa" w:w="4320"/>
+            <w:tcW w:type="dxa" w:w="4680"/>
           </w:tcPr>
           <w:p>
+            <w:pPr>
+              <w:spacing w:before="40" w:after="40"/>
+            </w:pPr>
             <w:r>
               <w:rPr>
                 <w:sz w:val="19"/>
@@ -208,9 +238,12 @@
       <w:tr>
         <w:tc>
           <w:tcPr>
-            <w:tcW w:type="dxa" w:w="4320"/>
+            <w:tcW w:type="dxa" w:w="4680"/>
           </w:tcPr>
           <w:p>
+            <w:pPr>
+              <w:spacing w:before="40" w:after="40"/>
+            </w:pPr>
             <w:r>
               <w:rPr>
                 <w:sz w:val="19"/>
@@ -226,9 +259,12 @@
         </w:tc>
         <w:tc>
           <w:tcPr>
-            <w:tcW w:type="dxa" w:w="4320"/>
+            <w:tcW w:type="dxa" w:w="4680"/>
           </w:tcPr>
           <w:p>
+            <w:pPr>
+              <w:spacing w:before="40" w:after="40"/>
+            </w:pPr>
             <w:r>
               <w:rPr>
                 <w:sz w:val="19"/>
@@ -267,17 +303,20 @@
         <w:tblLook w:firstColumn="1" w:firstRow="1" w:lastColumn="0" w:lastRow="0" w:noHBand="0" w:noVBand="1" w:val="04A0"/>
       </w:tblPr>
       <w:tblGrid>
-        <w:gridCol w:w="2880"/>
-        <w:gridCol w:w="2880"/>
-        <w:gridCol w:w="2880"/>
+        <w:gridCol w:w="3120"/>
+        <w:gridCol w:w="3120"/>
+        <w:gridCol w:w="3120"/>
       </w:tblGrid>
       <w:tr>
         <w:tc>
           <w:tcPr>
-            <w:tcW w:type="dxa" w:w="2880"/>
+            <w:tcW w:type="dxa" w:w="3120"/>
             <w:shd w:val="clear" w:color="auto" w:fill="D9C48A"/>
           </w:tcPr>
           <w:p>
+            <w:pPr>
+              <w:spacing w:before="60" w:after="60"/>
+            </w:pPr>
             <w:r>
               <w:rPr>
                 <w:b/>
@@ -295,10 +334,13 @@
         </w:tc>
         <w:tc>
           <w:tcPr>
-            <w:tcW w:type="dxa" w:w="2880"/>
+            <w:tcW w:type="dxa" w:w="3120"/>
             <w:shd w:val="clear" w:color="auto" w:fill="D9C48A"/>
           </w:tcPr>
           <w:p>
+            <w:pPr>
+              <w:spacing w:before="60" w:after="60"/>
+            </w:pPr>
             <w:r>
               <w:rPr>
                 <w:b/>
@@ -316,10 +358,13 @@
         </w:tc>
         <w:tc>
           <w:tcPr>
-            <w:tcW w:type="dxa" w:w="2880"/>
+            <w:tcW w:type="dxa" w:w="3120"/>
             <w:shd w:val="clear" w:color="auto" w:fill="D9C48A"/>
           </w:tcPr>
           <w:p>
+            <w:pPr>
+              <w:spacing w:before="60" w:after="60"/>
+            </w:pPr>
             <w:r>
               <w:rPr>
                 <w:b/>
@@ -339,9 +384,12 @@
       <w:tr>
         <w:tc>
           <w:tcPr>
-            <w:tcW w:type="dxa" w:w="2880"/>
+            <w:tcW w:type="dxa" w:w="3120"/>
           </w:tcPr>
           <w:p>
+            <w:pPr>
+              <w:spacing w:before="40" w:after="40"/>
+            </w:pPr>
             <w:r>
               <w:rPr>
                 <w:sz w:val="19"/>
@@ -357,9 +405,12 @@
         </w:tc>
         <w:tc>
           <w:tcPr>
-            <w:tcW w:type="dxa" w:w="2880"/>
+            <w:tcW w:type="dxa" w:w="3120"/>
           </w:tcPr>
           <w:p>
+            <w:pPr>
+              <w:spacing w:before="40" w:after="40"/>
+            </w:pPr>
             <w:r>
               <w:rPr>
                 <w:sz w:val="19"/>
@@ -375,9 +426,12 @@
         </w:tc>
         <w:tc>
           <w:tcPr>
-            <w:tcW w:type="dxa" w:w="2880"/>
+            <w:tcW w:type="dxa" w:w="3120"/>
           </w:tcPr>
           <w:p>
+            <w:pPr>
+              <w:spacing w:before="40" w:after="40"/>
+            </w:pPr>
             <w:r>
               <w:rPr>
                 <w:sz w:val="19"/>
@@ -395,9 +449,12 @@
       <w:tr>
         <w:tc>
           <w:tcPr>
-            <w:tcW w:type="dxa" w:w="2880"/>
+            <w:tcW w:type="dxa" w:w="3120"/>
           </w:tcPr>
           <w:p>
+            <w:pPr>
+              <w:spacing w:before="40" w:after="40"/>
+            </w:pPr>
             <w:r>
               <w:rPr>
                 <w:sz w:val="19"/>
@@ -413,9 +470,12 @@
         </w:tc>
         <w:tc>
           <w:tcPr>
-            <w:tcW w:type="dxa" w:w="2880"/>
+            <w:tcW w:type="dxa" w:w="3120"/>
           </w:tcPr>
           <w:p>
+            <w:pPr>
+              <w:spacing w:before="40" w:after="40"/>
+            </w:pPr>
             <w:r>
               <w:rPr>
                 <w:sz w:val="19"/>
@@ -431,9 +491,12 @@
         </w:tc>
         <w:tc>
           <w:tcPr>
-            <w:tcW w:type="dxa" w:w="2880"/>
+            <w:tcW w:type="dxa" w:w="3120"/>
           </w:tcPr>
           <w:p>
+            <w:pPr>
+              <w:spacing w:before="40" w:after="40"/>
+            </w:pPr>
             <w:r>
               <w:rPr>
                 <w:sz w:val="19"/>
@@ -451,9 +514,12 @@
       <w:tr>
         <w:tc>
           <w:tcPr>
-            <w:tcW w:type="dxa" w:w="2880"/>
+            <w:tcW w:type="dxa" w:w="3120"/>
           </w:tcPr>
           <w:p>
+            <w:pPr>
+              <w:spacing w:before="40" w:after="40"/>
+            </w:pPr>
             <w:r>
               <w:rPr>
                 <w:sz w:val="19"/>
@@ -469,9 +535,12 @@
         </w:tc>
         <w:tc>
           <w:tcPr>
-            <w:tcW w:type="dxa" w:w="2880"/>
+            <w:tcW w:type="dxa" w:w="3120"/>
           </w:tcPr>
           <w:p>
+            <w:pPr>
+              <w:spacing w:before="40" w:after="40"/>
+            </w:pPr>
             <w:r>
               <w:rPr>
                 <w:sz w:val="19"/>
@@ -500,9 +569,12 @@
         </w:tc>
         <w:tc>
           <w:tcPr>
-            <w:tcW w:type="dxa" w:w="2880"/>
+            <w:tcW w:type="dxa" w:w="3120"/>
           </w:tcPr>
           <w:p>
+            <w:pPr>
+              <w:spacing w:before="40" w:after="40"/>
+            </w:pPr>
             <w:r>
               <w:rPr>
                 <w:sz w:val="19"/>
@@ -520,9 +592,12 @@
       <w:tr>
         <w:tc>
           <w:tcPr>
-            <w:tcW w:type="dxa" w:w="2880"/>
+            <w:tcW w:type="dxa" w:w="3120"/>
           </w:tcPr>
           <w:p>
+            <w:pPr>
+              <w:spacing w:before="40" w:after="40"/>
+            </w:pPr>
             <w:r>
               <w:rPr>
                 <w:sz w:val="19"/>
@@ -538,9 +613,12 @@
         </w:tc>
         <w:tc>
           <w:tcPr>
-            <w:tcW w:type="dxa" w:w="2880"/>
+            <w:tcW w:type="dxa" w:w="3120"/>
           </w:tcPr>
           <w:p>
+            <w:pPr>
+              <w:spacing w:before="40" w:after="40"/>
+            </w:pPr>
             <w:r>
               <w:rPr>
                 <w:sz w:val="19"/>
@@ -563,9 +641,12 @@
         </w:tc>
         <w:tc>
           <w:tcPr>
-            <w:tcW w:type="dxa" w:w="2880"/>
+            <w:tcW w:type="dxa" w:w="3120"/>
           </w:tcPr>
           <w:p>
+            <w:pPr>
+              <w:spacing w:before="40" w:after="40"/>
+            </w:pPr>
             <w:r>
               <w:rPr>
                 <w:sz w:val="19"/>
@@ -583,9 +664,12 @@
       <w:tr>
         <w:tc>
           <w:tcPr>
-            <w:tcW w:type="dxa" w:w="2880"/>
+            <w:tcW w:type="dxa" w:w="3120"/>
           </w:tcPr>
           <w:p>
+            <w:pPr>
+              <w:spacing w:before="40" w:after="40"/>
+            </w:pPr>
             <w:r>
               <w:rPr>
                 <w:sz w:val="19"/>
@@ -601,9 +685,12 @@
         </w:tc>
         <w:tc>
           <w:tcPr>
-            <w:tcW w:type="dxa" w:w="2880"/>
+            <w:tcW w:type="dxa" w:w="3120"/>
           </w:tcPr>
           <w:p>
+            <w:pPr>
+              <w:spacing w:before="40" w:after="40"/>
+            </w:pPr>
             <w:r>
               <w:rPr>
                 <w:sz w:val="19"/>
@@ -619,9 +706,12 @@
         </w:tc>
         <w:tc>
           <w:tcPr>
-            <w:tcW w:type="dxa" w:w="2880"/>
+            <w:tcW w:type="dxa" w:w="3120"/>
           </w:tcPr>
           <w:p>
+            <w:pPr>
+              <w:spacing w:before="40" w:after="40"/>
+            </w:pPr>
             <w:r>
               <w:rPr>
                 <w:sz w:val="19"/>
@@ -639,9 +729,12 @@
       <w:tr>
         <w:tc>
           <w:tcPr>
-            <w:tcW w:type="dxa" w:w="2880"/>
+            <w:tcW w:type="dxa" w:w="3120"/>
           </w:tcPr>
           <w:p>
+            <w:pPr>
+              <w:spacing w:before="40" w:after="40"/>
+            </w:pPr>
             <w:r>
               <w:rPr>
                 <w:sz w:val="19"/>
@@ -657,9 +750,12 @@
         </w:tc>
         <w:tc>
           <w:tcPr>
-            <w:tcW w:type="dxa" w:w="2880"/>
+            <w:tcW w:type="dxa" w:w="3120"/>
           </w:tcPr>
           <w:p>
+            <w:pPr>
+              <w:spacing w:before="40" w:after="40"/>
+            </w:pPr>
             <w:r>
               <w:rPr>
                 <w:sz w:val="19"/>
@@ -682,9 +778,12 @@
         </w:tc>
         <w:tc>
           <w:tcPr>
-            <w:tcW w:type="dxa" w:w="2880"/>
+            <w:tcW w:type="dxa" w:w="3120"/>
           </w:tcPr>
           <w:p>
+            <w:pPr>
+              <w:spacing w:before="40" w:after="40"/>
+            </w:pPr>
             <w:r>
               <w:rPr>
                 <w:sz w:val="19"/>
@@ -702,9 +801,12 @@
       <w:tr>
         <w:tc>
           <w:tcPr>
-            <w:tcW w:type="dxa" w:w="2880"/>
+            <w:tcW w:type="dxa" w:w="3120"/>
           </w:tcPr>
           <w:p>
+            <w:pPr>
+              <w:spacing w:before="40" w:after="40"/>
+            </w:pPr>
             <w:r>
               <w:rPr>
                 <w:sz w:val="19"/>
@@ -720,9 +822,12 @@
         </w:tc>
         <w:tc>
           <w:tcPr>
-            <w:tcW w:type="dxa" w:w="2880"/>
+            <w:tcW w:type="dxa" w:w="3120"/>
           </w:tcPr>
           <w:p>
+            <w:pPr>
+              <w:spacing w:before="40" w:after="40"/>
+            </w:pPr>
             <w:r>
               <w:rPr>
                 <w:sz w:val="19"/>
@@ -745,9 +850,12 @@
         </w:tc>
         <w:tc>
           <w:tcPr>
-            <w:tcW w:type="dxa" w:w="2880"/>
+            <w:tcW w:type="dxa" w:w="3120"/>
           </w:tcPr>
           <w:p>
+            <w:pPr>
+              <w:spacing w:before="40" w:after="40"/>
+            </w:pPr>
             <w:r>
               <w:rPr>
                 <w:sz w:val="19"/>
@@ -765,9 +873,12 @@
       <w:tr>
         <w:tc>
           <w:tcPr>
-            <w:tcW w:type="dxa" w:w="2880"/>
+            <w:tcW w:type="dxa" w:w="3120"/>
           </w:tcPr>
           <w:p>
+            <w:pPr>
+              <w:spacing w:before="40" w:after="40"/>
+            </w:pPr>
             <w:r>
               <w:rPr>
                 <w:sz w:val="19"/>
@@ -783,9 +894,12 @@
         </w:tc>
         <w:tc>
           <w:tcPr>
-            <w:tcW w:type="dxa" w:w="2880"/>
+            <w:tcW w:type="dxa" w:w="3120"/>
           </w:tcPr>
           <w:p>
+            <w:pPr>
+              <w:spacing w:before="40" w:after="40"/>
+            </w:pPr>
             <w:r>
               <w:rPr>
                 <w:sz w:val="19"/>
@@ -808,9 +922,12 @@
         </w:tc>
         <w:tc>
           <w:tcPr>
-            <w:tcW w:type="dxa" w:w="2880"/>
+            <w:tcW w:type="dxa" w:w="3120"/>
           </w:tcPr>
           <w:p>
+            <w:pPr>
+              <w:spacing w:before="40" w:after="40"/>
+            </w:pPr>
             <w:r>
               <w:rPr>
                 <w:sz w:val="19"/>
@@ -828,9 +945,12 @@
       <w:tr>
         <w:tc>
           <w:tcPr>
-            <w:tcW w:type="dxa" w:w="2880"/>
+            <w:tcW w:type="dxa" w:w="3120"/>
           </w:tcPr>
           <w:p>
+            <w:pPr>
+              <w:spacing w:before="40" w:after="40"/>
+            </w:pPr>
             <w:r>
               <w:rPr>
                 <w:sz w:val="19"/>
@@ -846,9 +966,12 @@
         </w:tc>
         <w:tc>
           <w:tcPr>
-            <w:tcW w:type="dxa" w:w="2880"/>
+            <w:tcW w:type="dxa" w:w="3120"/>
           </w:tcPr>
           <w:p>
+            <w:pPr>
+              <w:spacing w:before="40" w:after="40"/>
+            </w:pPr>
             <w:r>
               <w:rPr>
                 <w:sz w:val="19"/>
@@ -864,9 +987,12 @@
         </w:tc>
         <w:tc>
           <w:tcPr>
-            <w:tcW w:type="dxa" w:w="2880"/>
+            <w:tcW w:type="dxa" w:w="3120"/>
           </w:tcPr>
           <w:p>
+            <w:pPr>
+              <w:spacing w:before="40" w:after="40"/>
+            </w:pPr>
             <w:r>
               <w:rPr>
                 <w:sz w:val="19"/>
@@ -884,9 +1010,12 @@
       <w:tr>
         <w:tc>
           <w:tcPr>
-            <w:tcW w:type="dxa" w:w="2880"/>
+            <w:tcW w:type="dxa" w:w="3120"/>
           </w:tcPr>
           <w:p>
+            <w:pPr>
+              <w:spacing w:before="40" w:after="40"/>
+            </w:pPr>
             <w:r>
               <w:rPr>
                 <w:sz w:val="19"/>
@@ -902,9 +1031,12 @@
         </w:tc>
         <w:tc>
           <w:tcPr>
-            <w:tcW w:type="dxa" w:w="2880"/>
+            <w:tcW w:type="dxa" w:w="3120"/>
           </w:tcPr>
           <w:p>
+            <w:pPr>
+              <w:spacing w:before="40" w:after="40"/>
+            </w:pPr>
             <w:r>
               <w:rPr>
                 <w:sz w:val="19"/>
@@ -933,9 +1065,12 @@
         </w:tc>
         <w:tc>
           <w:tcPr>
-            <w:tcW w:type="dxa" w:w="2880"/>
+            <w:tcW w:type="dxa" w:w="3120"/>
           </w:tcPr>
           <w:p>
+            <w:pPr>
+              <w:spacing w:before="40" w:after="40"/>
+            </w:pPr>
             <w:r>
               <w:rPr>
                 <w:sz w:val="19"/>
@@ -953,9 +1088,12 @@
       <w:tr>
         <w:tc>
           <w:tcPr>
-            <w:tcW w:type="dxa" w:w="2880"/>
+            <w:tcW w:type="dxa" w:w="3120"/>
           </w:tcPr>
           <w:p>
+            <w:pPr>
+              <w:spacing w:before="40" w:after="40"/>
+            </w:pPr>
             <w:r>
               <w:rPr>
                 <w:sz w:val="19"/>
@@ -971,9 +1109,12 @@
         </w:tc>
         <w:tc>
           <w:tcPr>
-            <w:tcW w:type="dxa" w:w="2880"/>
+            <w:tcW w:type="dxa" w:w="3120"/>
           </w:tcPr>
           <w:p>
+            <w:pPr>
+              <w:spacing w:before="40" w:after="40"/>
+            </w:pPr>
             <w:r>
               <w:rPr>
                 <w:sz w:val="19"/>
@@ -989,9 +1130,12 @@
         </w:tc>
         <w:tc>
           <w:tcPr>
-            <w:tcW w:type="dxa" w:w="2880"/>
+            <w:tcW w:type="dxa" w:w="3120"/>
           </w:tcPr>
           <w:p>
+            <w:pPr>
+              <w:spacing w:before="40" w:after="40"/>
+            </w:pPr>
             <w:r>
               <w:rPr>
                 <w:sz w:val="19"/>
@@ -1009,9 +1153,12 @@
       <w:tr>
         <w:tc>
           <w:tcPr>
-            <w:tcW w:type="dxa" w:w="2880"/>
+            <w:tcW w:type="dxa" w:w="3120"/>
           </w:tcPr>
           <w:p>
+            <w:pPr>
+              <w:spacing w:before="40" w:after="40"/>
+            </w:pPr>
             <w:r>
               <w:rPr>
                 <w:sz w:val="19"/>
@@ -1027,9 +1174,12 @@
         </w:tc>
         <w:tc>
           <w:tcPr>
-            <w:tcW w:type="dxa" w:w="2880"/>
+            <w:tcW w:type="dxa" w:w="3120"/>
           </w:tcPr>
           <w:p>
+            <w:pPr>
+              <w:spacing w:before="40" w:after="40"/>
+            </w:pPr>
             <w:r>
               <w:rPr>
                 <w:sz w:val="19"/>
@@ -1045,9 +1195,12 @@
         </w:tc>
         <w:tc>
           <w:tcPr>
-            <w:tcW w:type="dxa" w:w="2880"/>
+            <w:tcW w:type="dxa" w:w="3120"/>
           </w:tcPr>
           <w:p>
+            <w:pPr>
+              <w:spacing w:before="40" w:after="40"/>
+            </w:pPr>
             <w:r>
               <w:rPr>
                 <w:sz w:val="19"/>
@@ -1065,9 +1218,12 @@
       <w:tr>
         <w:tc>
           <w:tcPr>
-            <w:tcW w:type="dxa" w:w="2880"/>
+            <w:tcW w:type="dxa" w:w="3120"/>
           </w:tcPr>
           <w:p>
+            <w:pPr>
+              <w:spacing w:before="40" w:after="40"/>
+            </w:pPr>
             <w:r>
               <w:rPr>
                 <w:sz w:val="19"/>
@@ -1083,9 +1239,12 @@
         </w:tc>
         <w:tc>
           <w:tcPr>
-            <w:tcW w:type="dxa" w:w="2880"/>
+            <w:tcW w:type="dxa" w:w="3120"/>
           </w:tcPr>
           <w:p>
+            <w:pPr>
+              <w:spacing w:before="40" w:after="40"/>
+            </w:pPr>
             <w:r>
               <w:rPr>
                 <w:sz w:val="19"/>
@@ -1101,9 +1260,12 @@
         </w:tc>
         <w:tc>
           <w:tcPr>
-            <w:tcW w:type="dxa" w:w="2880"/>
+            <w:tcW w:type="dxa" w:w="3120"/>
           </w:tcPr>
           <w:p>
+            <w:pPr>
+              <w:spacing w:before="40" w:after="40"/>
+            </w:pPr>
             <w:r>
               <w:rPr>
                 <w:sz w:val="19"/>
@@ -1121,9 +1283,12 @@
       <w:tr>
         <w:tc>
           <w:tcPr>
-            <w:tcW w:type="dxa" w:w="2880"/>
+            <w:tcW w:type="dxa" w:w="3120"/>
           </w:tcPr>
           <w:p>
+            <w:pPr>
+              <w:spacing w:before="40" w:after="40"/>
+            </w:pPr>
             <w:r>
               <w:rPr>
                 <w:sz w:val="19"/>
@@ -1139,9 +1304,12 @@
         </w:tc>
         <w:tc>
           <w:tcPr>
-            <w:tcW w:type="dxa" w:w="2880"/>
+            <w:tcW w:type="dxa" w:w="3120"/>
           </w:tcPr>
           <w:p>
+            <w:pPr>
+              <w:spacing w:before="40" w:after="40"/>
+            </w:pPr>
             <w:r>
               <w:rPr>
                 <w:sz w:val="19"/>
@@ -1157,9 +1325,12 @@
         </w:tc>
         <w:tc>
           <w:tcPr>
-            <w:tcW w:type="dxa" w:w="2880"/>
+            <w:tcW w:type="dxa" w:w="3120"/>
           </w:tcPr>
           <w:p>
+            <w:pPr>
+              <w:spacing w:before="40" w:after="40"/>
+            </w:pPr>
             <w:r>
               <w:rPr>
                 <w:sz w:val="19"/>
@@ -1177,9 +1348,12 @@
       <w:tr>
         <w:tc>
           <w:tcPr>
-            <w:tcW w:type="dxa" w:w="2880"/>
+            <w:tcW w:type="dxa" w:w="3120"/>
           </w:tcPr>
           <w:p>
+            <w:pPr>
+              <w:spacing w:before="40" w:after="40"/>
+            </w:pPr>
             <w:r>
               <w:rPr>
                 <w:sz w:val="19"/>
@@ -1195,9 +1369,12 @@
         </w:tc>
         <w:tc>
           <w:tcPr>
-            <w:tcW w:type="dxa" w:w="2880"/>
+            <w:tcW w:type="dxa" w:w="3120"/>
           </w:tcPr>
           <w:p>
+            <w:pPr>
+              <w:spacing w:before="40" w:after="40"/>
+            </w:pPr>
             <w:r>
               <w:rPr>
                 <w:sz w:val="19"/>
@@ -1213,9 +1390,12 @@
         </w:tc>
         <w:tc>
           <w:tcPr>
-            <w:tcW w:type="dxa" w:w="2880"/>
+            <w:tcW w:type="dxa" w:w="3120"/>
           </w:tcPr>
           <w:p>
+            <w:pPr>
+              <w:spacing w:before="40" w:after="40"/>
+            </w:pPr>
             <w:r>
               <w:rPr>
                 <w:sz w:val="19"/>
@@ -1233,9 +1413,12 @@
       <w:tr>
         <w:tc>
           <w:tcPr>
-            <w:tcW w:type="dxa" w:w="2880"/>
+            <w:tcW w:type="dxa" w:w="3120"/>
           </w:tcPr>
           <w:p>
+            <w:pPr>
+              <w:spacing w:before="40" w:after="40"/>
+            </w:pPr>
             <w:r>
               <w:rPr>
                 <w:sz w:val="19"/>
@@ -1251,9 +1434,12 @@
         </w:tc>
         <w:tc>
           <w:tcPr>
-            <w:tcW w:type="dxa" w:w="2880"/>
+            <w:tcW w:type="dxa" w:w="3120"/>
           </w:tcPr>
           <w:p>
+            <w:pPr>
+              <w:spacing w:before="40" w:after="40"/>
+            </w:pPr>
             <w:r>
               <w:rPr>
                 <w:sz w:val="19"/>
@@ -1276,9 +1462,12 @@
         </w:tc>
         <w:tc>
           <w:tcPr>
-            <w:tcW w:type="dxa" w:w="2880"/>
+            <w:tcW w:type="dxa" w:w="3120"/>
           </w:tcPr>
           <w:p>
+            <w:pPr>
+              <w:spacing w:before="40" w:after="40"/>
+            </w:pPr>
             <w:r>
               <w:rPr>
                 <w:sz w:val="19"/>
@@ -1296,9 +1485,12 @@
       <w:tr>
         <w:tc>
           <w:tcPr>
-            <w:tcW w:type="dxa" w:w="2880"/>
+            <w:tcW w:type="dxa" w:w="3120"/>
           </w:tcPr>
           <w:p>
+            <w:pPr>
+              <w:spacing w:before="40" w:after="40"/>
+            </w:pPr>
             <w:r>
               <w:rPr>
                 <w:sz w:val="19"/>
@@ -1314,9 +1506,12 @@
         </w:tc>
         <w:tc>
           <w:tcPr>
-            <w:tcW w:type="dxa" w:w="2880"/>
+            <w:tcW w:type="dxa" w:w="3120"/>
           </w:tcPr>
           <w:p>
+            <w:pPr>
+              <w:spacing w:before="40" w:after="40"/>
+            </w:pPr>
             <w:r>
               <w:rPr>
                 <w:sz w:val="19"/>
@@ -1332,9 +1527,12 @@
         </w:tc>
         <w:tc>
           <w:tcPr>
-            <w:tcW w:type="dxa" w:w="2880"/>
+            <w:tcW w:type="dxa" w:w="3120"/>
           </w:tcPr>
           <w:p>
+            <w:pPr>
+              <w:spacing w:before="40" w:after="40"/>
+            </w:pPr>
             <w:r>
               <w:rPr>
                 <w:sz w:val="19"/>
@@ -1352,9 +1550,12 @@
       <w:tr>
         <w:tc>
           <w:tcPr>
-            <w:tcW w:type="dxa" w:w="2880"/>
+            <w:tcW w:type="dxa" w:w="3120"/>
           </w:tcPr>
           <w:p>
+            <w:pPr>
+              <w:spacing w:before="40" w:after="40"/>
+            </w:pPr>
             <w:r>
               <w:rPr>
                 <w:sz w:val="19"/>
@@ -1370,9 +1571,12 @@
         </w:tc>
         <w:tc>
           <w:tcPr>
-            <w:tcW w:type="dxa" w:w="2880"/>
+            <w:tcW w:type="dxa" w:w="3120"/>
           </w:tcPr>
           <w:p>
+            <w:pPr>
+              <w:spacing w:before="40" w:after="40"/>
+            </w:pPr>
             <w:r>
               <w:rPr>
                 <w:sz w:val="19"/>
@@ -1388,9 +1592,12 @@
         </w:tc>
         <w:tc>
           <w:tcPr>
-            <w:tcW w:type="dxa" w:w="2880"/>
+            <w:tcW w:type="dxa" w:w="3120"/>
           </w:tcPr>
           <w:p>
+            <w:pPr>
+              <w:spacing w:before="40" w:after="40"/>
+            </w:pPr>
             <w:r>
               <w:rPr>
                 <w:sz w:val="19"/>
@@ -1408,9 +1615,12 @@
       <w:tr>
         <w:tc>
           <w:tcPr>
-            <w:tcW w:type="dxa" w:w="2880"/>
+            <w:tcW w:type="dxa" w:w="3120"/>
           </w:tcPr>
           <w:p>
+            <w:pPr>
+              <w:spacing w:before="40" w:after="40"/>
+            </w:pPr>
             <w:r>
               <w:rPr>
                 <w:sz w:val="19"/>
@@ -1426,9 +1636,12 @@
         </w:tc>
         <w:tc>
           <w:tcPr>
-            <w:tcW w:type="dxa" w:w="2880"/>
+            <w:tcW w:type="dxa" w:w="3120"/>
           </w:tcPr>
           <w:p>
+            <w:pPr>
+              <w:spacing w:before="40" w:after="40"/>
+            </w:pPr>
             <w:r>
               <w:rPr>
                 <w:sz w:val="19"/>
@@ -1444,9 +1657,12 @@
         </w:tc>
         <w:tc>
           <w:tcPr>
-            <w:tcW w:type="dxa" w:w="2880"/>
+            <w:tcW w:type="dxa" w:w="3120"/>
           </w:tcPr>
           <w:p>
+            <w:pPr>
+              <w:spacing w:before="40" w:after="40"/>
+            </w:pPr>
             <w:r>
               <w:rPr>
                 <w:sz w:val="19"/>
@@ -1464,9 +1680,12 @@
       <w:tr>
         <w:tc>
           <w:tcPr>
-            <w:tcW w:type="dxa" w:w="2880"/>
+            <w:tcW w:type="dxa" w:w="3120"/>
           </w:tcPr>
           <w:p>
+            <w:pPr>
+              <w:spacing w:before="40" w:after="40"/>
+            </w:pPr>
             <w:r>
               <w:rPr>
                 <w:sz w:val="19"/>
@@ -1482,9 +1701,12 @@
         </w:tc>
         <w:tc>
           <w:tcPr>
-            <w:tcW w:type="dxa" w:w="2880"/>
+            <w:tcW w:type="dxa" w:w="3120"/>
           </w:tcPr>
           <w:p>
+            <w:pPr>
+              <w:spacing w:before="40" w:after="40"/>
+            </w:pPr>
             <w:r>
               <w:rPr>
                 <w:sz w:val="19"/>
@@ -1500,9 +1722,12 @@
         </w:tc>
         <w:tc>
           <w:tcPr>
-            <w:tcW w:type="dxa" w:w="2880"/>
+            <w:tcW w:type="dxa" w:w="3120"/>
           </w:tcPr>
           <w:p>
+            <w:pPr>
+              <w:spacing w:before="40" w:after="40"/>
+            </w:pPr>
             <w:r>
               <w:rPr>
                 <w:sz w:val="19"/>
@@ -1534,16 +1759,19 @@
         <w:tblLook w:firstColumn="1" w:firstRow="1" w:lastColumn="0" w:lastRow="0" w:noHBand="0" w:noVBand="1" w:val="04A0"/>
       </w:tblPr>
       <w:tblGrid>
-        <w:gridCol w:w="4320"/>
-        <w:gridCol w:w="4320"/>
+        <w:gridCol w:w="4680"/>
+        <w:gridCol w:w="4680"/>
       </w:tblGrid>
       <w:tr>
         <w:tc>
           <w:tcPr>
-            <w:tcW w:type="dxa" w:w="4320"/>
+            <w:tcW w:type="dxa" w:w="4680"/>
             <w:shd w:val="clear" w:color="auto" w:fill="D9C48A"/>
           </w:tcPr>
           <w:p>
+            <w:pPr>
+              <w:spacing w:before="60" w:after="60"/>
+            </w:pPr>
             <w:r>
               <w:rPr>
                 <w:b/>
@@ -1561,10 +1789,13 @@
         </w:tc>
         <w:tc>
           <w:tcPr>
-            <w:tcW w:type="dxa" w:w="4320"/>
+            <w:tcW w:type="dxa" w:w="4680"/>
             <w:shd w:val="clear" w:color="auto" w:fill="D9C48A"/>
           </w:tcPr>
           <w:p>
+            <w:pPr>
+              <w:spacing w:before="60" w:after="60"/>
+            </w:pPr>
             <w:r>
               <w:rPr>
                 <w:b/>
@@ -1584,9 +1815,12 @@
       <w:tr>
         <w:tc>
           <w:tcPr>
-            <w:tcW w:type="dxa" w:w="4320"/>
+            <w:tcW w:type="dxa" w:w="4680"/>
           </w:tcPr>
           <w:p>
+            <w:pPr>
+              <w:spacing w:before="40" w:after="40"/>
+            </w:pPr>
             <w:r>
               <w:rPr>
                 <w:sz w:val="19"/>
@@ -1602,9 +1836,12 @@
         </w:tc>
         <w:tc>
           <w:tcPr>
-            <w:tcW w:type="dxa" w:w="4320"/>
+            <w:tcW w:type="dxa" w:w="4680"/>
           </w:tcPr>
           <w:p>
+            <w:pPr>
+              <w:spacing w:before="40" w:after="40"/>
+            </w:pPr>
             <w:r>
               <w:rPr>
                 <w:sz w:val="19"/>
@@ -1681,9 +1918,12 @@
       <w:tr>
         <w:tc>
           <w:tcPr>
-            <w:tcW w:type="dxa" w:w="4320"/>
+            <w:tcW w:type="dxa" w:w="4680"/>
           </w:tcPr>
           <w:p>
+            <w:pPr>
+              <w:spacing w:before="40" w:after="40"/>
+            </w:pPr>
             <w:r>
               <w:rPr>
                 <w:sz w:val="19"/>
@@ -1699,9 +1939,12 @@
         </w:tc>
         <w:tc>
           <w:tcPr>
-            <w:tcW w:type="dxa" w:w="4320"/>
+            <w:tcW w:type="dxa" w:w="4680"/>
           </w:tcPr>
           <w:p>
+            <w:pPr>
+              <w:spacing w:before="40" w:after="40"/>
+            </w:pPr>
             <w:r>
               <w:rPr>
                 <w:sz w:val="19"/>
@@ -1719,9 +1962,12 @@
       <w:tr>
         <w:tc>
           <w:tcPr>
-            <w:tcW w:type="dxa" w:w="4320"/>
+            <w:tcW w:type="dxa" w:w="4680"/>
           </w:tcPr>
           <w:p>
+            <w:pPr>
+              <w:spacing w:before="40" w:after="40"/>
+            </w:pPr>
             <w:r>
               <w:rPr>
                 <w:sz w:val="19"/>
@@ -1737,9 +1983,12 @@
         </w:tc>
         <w:tc>
           <w:tcPr>
-            <w:tcW w:type="dxa" w:w="4320"/>
+            <w:tcW w:type="dxa" w:w="4680"/>
           </w:tcPr>
           <w:p>
+            <w:pPr>
+              <w:spacing w:before="40" w:after="40"/>
+            </w:pPr>
             <w:r>
               <w:rPr>
                 <w:sz w:val="19"/>
@@ -1757,9 +2006,12 @@
       <w:tr>
         <w:tc>
           <w:tcPr>
-            <w:tcW w:type="dxa" w:w="4320"/>
+            <w:tcW w:type="dxa" w:w="4680"/>
           </w:tcPr>
           <w:p>
+            <w:pPr>
+              <w:spacing w:before="40" w:after="40"/>
+            </w:pPr>
             <w:r>
               <w:rPr>
                 <w:sz w:val="19"/>
@@ -1775,9 +2027,12 @@
         </w:tc>
         <w:tc>
           <w:tcPr>
-            <w:tcW w:type="dxa" w:w="4320"/>
+            <w:tcW w:type="dxa" w:w="4680"/>
           </w:tcPr>
           <w:p>
+            <w:pPr>
+              <w:spacing w:before="40" w:after="40"/>
+            </w:pPr>
             <w:r>
               <w:rPr>
                 <w:sz w:val="19"/>
@@ -1815,9 +2070,12 @@
       <w:tr>
         <w:tc>
           <w:tcPr>
-            <w:tcW w:type="dxa" w:w="4320"/>
+            <w:tcW w:type="dxa" w:w="4680"/>
           </w:tcPr>
           <w:p>
+            <w:pPr>
+              <w:spacing w:before="40" w:after="40"/>
+            </w:pPr>
             <w:r>
               <w:rPr>
                 <w:sz w:val="19"/>
@@ -1833,9 +2091,12 @@
         </w:tc>
         <w:tc>
           <w:tcPr>
-            <w:tcW w:type="dxa" w:w="4320"/>
+            <w:tcW w:type="dxa" w:w="4680"/>
           </w:tcPr>
           <w:p>
+            <w:pPr>
+              <w:spacing w:before="40" w:after="40"/>
+            </w:pPr>
             <w:r>
               <w:rPr>
                 <w:sz w:val="19"/>
@@ -1892,9 +2153,12 @@
       <w:tr>
         <w:tc>
           <w:tcPr>
-            <w:tcW w:type="dxa" w:w="4320"/>
+            <w:tcW w:type="dxa" w:w="4680"/>
           </w:tcPr>
           <w:p>
+            <w:pPr>
+              <w:spacing w:before="40" w:after="40"/>
+            </w:pPr>
             <w:r>
               <w:rPr>
                 <w:sz w:val="19"/>
@@ -1910,9 +2174,12 @@
         </w:tc>
         <w:tc>
           <w:tcPr>
-            <w:tcW w:type="dxa" w:w="4320"/>
+            <w:tcW w:type="dxa" w:w="4680"/>
           </w:tcPr>
           <w:p>
+            <w:pPr>
+              <w:spacing w:before="40" w:after="40"/>
+            </w:pPr>
             <w:r>
               <w:rPr>
                 <w:sz w:val="19"/>
@@ -1982,9 +2249,12 @@
       <w:tr>
         <w:tc>
           <w:tcPr>
-            <w:tcW w:type="dxa" w:w="4320"/>
+            <w:tcW w:type="dxa" w:w="4680"/>
           </w:tcPr>
           <w:p>
+            <w:pPr>
+              <w:spacing w:before="40" w:after="40"/>
+            </w:pPr>
             <w:r>
               <w:rPr>
                 <w:sz w:val="19"/>
@@ -2000,9 +2270,12 @@
         </w:tc>
         <w:tc>
           <w:tcPr>
-            <w:tcW w:type="dxa" w:w="4320"/>
+            <w:tcW w:type="dxa" w:w="4680"/>
           </w:tcPr>
           <w:p>
+            <w:pPr>
+              <w:spacing w:before="40" w:after="40"/>
+            </w:pPr>
             <w:r>
               <w:rPr>
                 <w:sz w:val="19"/>
@@ -2046,9 +2319,12 @@
       <w:tr>
         <w:tc>
           <w:tcPr>
-            <w:tcW w:type="dxa" w:w="4320"/>
+            <w:tcW w:type="dxa" w:w="4680"/>
           </w:tcPr>
           <w:p>
+            <w:pPr>
+              <w:spacing w:before="40" w:after="40"/>
+            </w:pPr>
             <w:r>
               <w:rPr>
                 <w:sz w:val="19"/>
@@ -2064,9 +2340,12 @@
         </w:tc>
         <w:tc>
           <w:tcPr>
-            <w:tcW w:type="dxa" w:w="4320"/>
+            <w:tcW w:type="dxa" w:w="4680"/>
           </w:tcPr>
           <w:p>
+            <w:pPr>
+              <w:spacing w:before="40" w:after="40"/>
+            </w:pPr>
             <w:r>
               <w:rPr>
                 <w:sz w:val="19"/>
@@ -2084,9 +2363,12 @@
       <w:tr>
         <w:tc>
           <w:tcPr>
-            <w:tcW w:type="dxa" w:w="4320"/>
+            <w:tcW w:type="dxa" w:w="4680"/>
           </w:tcPr>
           <w:p>
+            <w:pPr>
+              <w:spacing w:before="40" w:after="40"/>
+            </w:pPr>
             <w:r>
               <w:rPr>
                 <w:sz w:val="19"/>
@@ -2102,9 +2384,12 @@
         </w:tc>
         <w:tc>
           <w:tcPr>
-            <w:tcW w:type="dxa" w:w="4320"/>
+            <w:tcW w:type="dxa" w:w="4680"/>
           </w:tcPr>
           <w:p>
+            <w:pPr>
+              <w:spacing w:before="40" w:after="40"/>
+            </w:pPr>
             <w:r>
               <w:rPr>
                 <w:sz w:val="19"/>
@@ -2148,9 +2433,12 @@
       <w:tr>
         <w:tc>
           <w:tcPr>
-            <w:tcW w:type="dxa" w:w="4320"/>
+            <w:tcW w:type="dxa" w:w="4680"/>
           </w:tcPr>
           <w:p>
+            <w:pPr>
+              <w:spacing w:before="40" w:after="40"/>
+            </w:pPr>
             <w:r>
               <w:rPr>
                 <w:sz w:val="19"/>
@@ -2166,9 +2454,12 @@
         </w:tc>
         <w:tc>
           <w:tcPr>
-            <w:tcW w:type="dxa" w:w="4320"/>
+            <w:tcW w:type="dxa" w:w="4680"/>
           </w:tcPr>
           <w:p>
+            <w:pPr>
+              <w:spacing w:before="40" w:after="40"/>
+            </w:pPr>
             <w:r>
               <w:rPr>
                 <w:sz w:val="19"/>
@@ -2225,9 +2516,12 @@
       <w:tr>
         <w:tc>
           <w:tcPr>
-            <w:tcW w:type="dxa" w:w="4320"/>
+            <w:tcW w:type="dxa" w:w="4680"/>
           </w:tcPr>
           <w:p>
+            <w:pPr>
+              <w:spacing w:before="40" w:after="40"/>
+            </w:pPr>
             <w:r>
               <w:rPr>
                 <w:sz w:val="19"/>
@@ -2243,9 +2537,12 @@
         </w:tc>
         <w:tc>
           <w:tcPr>
-            <w:tcW w:type="dxa" w:w="4320"/>
+            <w:tcW w:type="dxa" w:w="4680"/>
           </w:tcPr>
           <w:p>
+            <w:pPr>
+              <w:spacing w:before="40" w:after="40"/>
+            </w:pPr>
             <w:r>
               <w:rPr>
                 <w:sz w:val="19"/>
@@ -2302,9 +2599,12 @@
       <w:tr>
         <w:tc>
           <w:tcPr>
-            <w:tcW w:type="dxa" w:w="4320"/>
+            <w:tcW w:type="dxa" w:w="4680"/>
           </w:tcPr>
           <w:p>
+            <w:pPr>
+              <w:spacing w:before="40" w:after="40"/>
+            </w:pPr>
             <w:r>
               <w:rPr>
                 <w:sz w:val="19"/>
@@ -2320,9 +2620,12 @@
         </w:tc>
         <w:tc>
           <w:tcPr>
-            <w:tcW w:type="dxa" w:w="4320"/>
+            <w:tcW w:type="dxa" w:w="4680"/>
           </w:tcPr>
           <w:p>
+            <w:pPr>
+              <w:spacing w:before="40" w:after="40"/>
+            </w:pPr>
             <w:r>
               <w:rPr>
                 <w:sz w:val="19"/>
@@ -2392,9 +2695,12 @@
       <w:tr>
         <w:tc>
           <w:tcPr>
-            <w:tcW w:type="dxa" w:w="4320"/>
+            <w:tcW w:type="dxa" w:w="4680"/>
           </w:tcPr>
           <w:p>
+            <w:pPr>
+              <w:spacing w:before="40" w:after="40"/>
+            </w:pPr>
             <w:r>
               <w:rPr>
                 <w:sz w:val="19"/>
@@ -2410,9 +2716,12 @@
         </w:tc>
         <w:tc>
           <w:tcPr>
-            <w:tcW w:type="dxa" w:w="4320"/>
+            <w:tcW w:type="dxa" w:w="4680"/>
           </w:tcPr>
           <w:p>
+            <w:pPr>
+              <w:spacing w:before="40" w:after="40"/>
+            </w:pPr>
             <w:r>
               <w:rPr>
                 <w:sz w:val="19"/>
@@ -2450,9 +2759,12 @@
       <w:tr>
         <w:tc>
           <w:tcPr>
-            <w:tcW w:type="dxa" w:w="4320"/>
+            <w:tcW w:type="dxa" w:w="4680"/>
           </w:tcPr>
           <w:p>
+            <w:pPr>
+              <w:spacing w:before="40" w:after="40"/>
+            </w:pPr>
             <w:r>
               <w:rPr>
                 <w:sz w:val="19"/>
@@ -2468,9 +2780,12 @@
         </w:tc>
         <w:tc>
           <w:tcPr>
-            <w:tcW w:type="dxa" w:w="4320"/>
+            <w:tcW w:type="dxa" w:w="4680"/>
           </w:tcPr>
           <w:p>
+            <w:pPr>
+              <w:spacing w:before="40" w:after="40"/>
+            </w:pPr>
             <w:r>
               <w:rPr>
                 <w:sz w:val="19"/>
@@ -2521,6 +2836,9 @@
     </w:tbl>
     <w:p/>
     <w:p>
+      <w:pPr>
+        <w:spacing w:before="20" w:after="60"/>
+      </w:pPr>
       <w:r>
         <w:rPr>
           <w:b/>
@@ -2540,6 +2858,9 @@
       </w:r>
     </w:p>
     <w:p>
+      <w:pPr>
+        <w:spacing w:before="20" w:after="60"/>
+      </w:pPr>
       <w:r>
         <w:rPr>
           <w:rFonts w:ascii="Consolas" w:hAnsi="Consolas"/>
@@ -2548,40 +2869,67 @@
         <w:t>backend/requirements.txt</w:t>
       </w:r>
     </w:p>
+    <w:tbl>
+      <w:tblPr>
+        <w:tblStyle w:val="TableGrid"/>
+        <w:tblW w:type="auto" w:w="0"/>
+        <w:tblLook w:firstColumn="1" w:firstRow="1" w:lastColumn="0" w:lastRow="0" w:noHBand="0" w:noVBand="1" w:val="04A0"/>
+      </w:tblPr>
+      <w:tblGrid>
+        <w:gridCol w:w="9360"/>
+      </w:tblGrid>
+      <w:tr>
+        <w:tc>
+          <w:tcPr>
+            <w:tcW w:type="dxa" w:w="9360"/>
+            <w:shd w:val="clear" w:color="auto" w:fill="F6F8FA"/>
+          </w:tcPr>
+          <w:p>
+            <w:pPr>
+              <w:spacing w:before="80" w:after="80" w:line="276" w:lineRule="auto"/>
+            </w:pPr>
+            <w:r/>
+            <w:r>
+              <w:rPr>
+                <w:rFonts w:ascii="Consolas" w:hAnsi="Consolas"/>
+                <w:color w:val="24292F"/>
+                <w:sz w:val="17"/>
+              </w:rPr>
+              <w:t>fastapi==0.143.3</w:t>
+              <w:br/>
+              <w:t>uvicorn[standard]==0.54.0</w:t>
+              <w:br/>
+              <w:t>pydantic-settings==2.16.0</w:t>
+              <w:br/>
+              <w:t>sqlalchemy[asyncio]==2.1.5</w:t>
+              <w:br/>
+              <w:t>asyncpg==0.32.0</w:t>
+              <w:br/>
+              <w:t>alembic==1.20.0</w:t>
+              <w:br/>
+              <w:t>qdrant-client==1.19.1</w:t>
+              <w:br/>
+              <w:t>fastembed==0.9.0</w:t>
+              <w:br/>
+              <w:t>openai==3.33.0</w:t>
+              <w:br/>
+              <w:t>redis==8.1.0</w:t>
+              <w:br/>
+              <w:t>ddgs==9.16.0</w:t>
+              <w:br/>
+              <w:t>httpx==0.28.1</w:t>
+              <w:br/>
+              <w:t>beautifulsoup4==4.15.0</w:t>
+            </w:r>
+          </w:p>
+        </w:tc>
+      </w:tr>
+    </w:tbl>
+    <w:p/>
     <w:p>
-      <w:r>
-        <w:rPr>
-          <w:rFonts w:ascii="Consolas" w:hAnsi="Consolas"/>
-          <w:sz w:val="17"/>
-        </w:rPr>
-        <w:t>fastapi==0.143.3</w:t>
-        <w:br/>
-        <w:t>uvicorn[standard]==0.54.0</w:t>
-        <w:br/>
-        <w:t>pydantic-settings==2.16.0</w:t>
-        <w:br/>
-        <w:t>sqlalchemy[asyncio]==2.1.5</w:t>
-        <w:br/>
-        <w:t>asyncpg==0.32.0</w:t>
-        <w:br/>
-        <w:t>alembic==1.20.0</w:t>
-        <w:br/>
-        <w:t>qdrant-client==1.19.1</w:t>
-        <w:br/>
-        <w:t>fastembed==0.9.0</w:t>
-        <w:br/>
-        <w:t>openai==3.33.0</w:t>
-        <w:br/>
-        <w:t>redis==8.1.0</w:t>
-        <w:br/>
-        <w:t>ddgs==9.16.0</w:t>
-        <w:br/>
-        <w:t>httpx==0.28.1</w:t>
-        <w:br/>
-        <w:t>beautifulsoup4==4.15.0</w:t>
-      </w:r>
-    </w:p>
-    <w:p>
+      <w:pPr>
+        <w:spacing w:before="20" w:after="60"/>
+      </w:pPr>
       <w:r>
         <w:rPr>
           <w:rFonts w:ascii="Consolas" w:hAnsi="Consolas"/>
@@ -2590,24 +2938,51 @@
         <w:t>backend/requirements-dev.txt</w:t>
       </w:r>
     </w:p>
+    <w:tbl>
+      <w:tblPr>
+        <w:tblStyle w:val="TableGrid"/>
+        <w:tblW w:type="auto" w:w="0"/>
+        <w:tblLook w:firstColumn="1" w:firstRow="1" w:lastColumn="0" w:lastRow="0" w:noHBand="0" w:noVBand="1" w:val="04A0"/>
+      </w:tblPr>
+      <w:tblGrid>
+        <w:gridCol w:w="9360"/>
+      </w:tblGrid>
+      <w:tr>
+        <w:tc>
+          <w:tcPr>
+            <w:tcW w:type="dxa" w:w="9360"/>
+            <w:shd w:val="clear" w:color="auto" w:fill="F6F8FA"/>
+          </w:tcPr>
+          <w:p>
+            <w:pPr>
+              <w:spacing w:before="80" w:after="80" w:line="276" w:lineRule="auto"/>
+            </w:pPr>
+            <w:r/>
+            <w:r>
+              <w:rPr>
+                <w:rFonts w:ascii="Consolas" w:hAnsi="Consolas"/>
+                <w:color w:val="24292F"/>
+                <w:sz w:val="17"/>
+              </w:rPr>
+              <w:t>-r requirements.txt</w:t>
+              <w:br/>
+              <w:t>pytest==9.1.1</w:t>
+              <w:br/>
+              <w:t>pytest-asyncio==1.4.0</w:t>
+              <w:br/>
+              <w:t>ruff==0.17.1</w:t>
+              <w:br/>
+              <w:t>locust==2.46.7</w:t>
+            </w:r>
+          </w:p>
+        </w:tc>
+      </w:tr>
+    </w:tbl>
+    <w:p/>
     <w:p>
-      <w:r>
-        <w:rPr>
-          <w:rFonts w:ascii="Consolas" w:hAnsi="Consolas"/>
-          <w:sz w:val="17"/>
-        </w:rPr>
-        <w:t>-r requirements.txt</w:t>
-        <w:br/>
-        <w:t>pytest==9.1.1</w:t>
-        <w:br/>
-        <w:t>pytest-asyncio==1.4.0</w:t>
-        <w:br/>
-        <w:t>ruff==0.17.1</w:t>
-        <w:br/>
-        <w:t>locust==2.46.7</w:t>
-      </w:r>
-    </w:p>
-    <w:p>
+      <w:pPr>
+        <w:spacing w:before="20" w:after="60"/>
+      </w:pPr>
       <w:r>
         <w:t xml:space="preserve">Phụ thuộc gián tiếp được khoá trong </w:t>
       </w:r>
@@ -2649,18 +3024,21 @@
         <w:tblLook w:firstColumn="1" w:firstRow="1" w:lastColumn="0" w:lastRow="0" w:noHBand="0" w:noVBand="1" w:val="04A0"/>
       </w:tblPr>
       <w:tblGrid>
-        <w:gridCol w:w="2160"/>
-        <w:gridCol w:w="2160"/>
-        <w:gridCol w:w="2160"/>
-        <w:gridCol w:w="2160"/>
+        <w:gridCol w:w="2340"/>
+        <w:gridCol w:w="2340"/>
+        <w:gridCol w:w="2340"/>
+        <w:gridCol w:w="2340"/>
       </w:tblGrid>
       <w:tr>
         <w:tc>
           <w:tcPr>
-            <w:tcW w:type="dxa" w:w="2160"/>
+            <w:tcW w:type="dxa" w:w="2340"/>
             <w:shd w:val="clear" w:color="auto" w:fill="D9C48A"/>
           </w:tcPr>
           <w:p>
+            <w:pPr>
+              <w:spacing w:before="60" w:after="60"/>
+            </w:pPr>
             <w:r>
               <w:rPr>
                 <w:b/>
@@ -2678,10 +3056,13 @@
         </w:tc>
         <w:tc>
           <w:tcPr>
-            <w:tcW w:type="dxa" w:w="2160"/>
+            <w:tcW w:type="dxa" w:w="2340"/>
             <w:shd w:val="clear" w:color="auto" w:fill="D9C48A"/>
           </w:tcPr>
           <w:p>
+            <w:pPr>
+              <w:spacing w:before="60" w:after="60"/>
+            </w:pPr>
             <w:r>
               <w:rPr>
                 <w:b/>
@@ -2699,10 +3080,13 @@
         </w:tc>
         <w:tc>
           <w:tcPr>
-            <w:tcW w:type="dxa" w:w="2160"/>
+            <w:tcW w:type="dxa" w:w="2340"/>
             <w:shd w:val="clear" w:color="auto" w:fill="D9C48A"/>
           </w:tcPr>
           <w:p>
+            <w:pPr>
+              <w:spacing w:before="60" w:after="60"/>
+            </w:pPr>
             <w:r>
               <w:rPr>
                 <w:b/>
@@ -2720,10 +3104,13 @@
         </w:tc>
         <w:tc>
           <w:tcPr>
-            <w:tcW w:type="dxa" w:w="2160"/>
+            <w:tcW w:type="dxa" w:w="2340"/>
             <w:shd w:val="clear" w:color="auto" w:fill="D9C48A"/>
           </w:tcPr>
           <w:p>
+            <w:pPr>
+              <w:spacing w:before="60" w:after="60"/>
+            </w:pPr>
             <w:r>
               <w:rPr>
                 <w:b/>
@@ -2743,9 +3130,12 @@
       <w:tr>
         <w:tc>
           <w:tcPr>
-            <w:tcW w:type="dxa" w:w="2160"/>
+            <w:tcW w:type="dxa" w:w="2340"/>
           </w:tcPr>
           <w:p>
+            <w:pPr>
+              <w:spacing w:before="40" w:after="40"/>
+            </w:pPr>
             <w:r>
               <w:rPr>
                 <w:sz w:val="19"/>
@@ -2761,9 +3151,12 @@
         </w:tc>
         <w:tc>
           <w:tcPr>
-            <w:tcW w:type="dxa" w:w="2160"/>
+            <w:tcW w:type="dxa" w:w="2340"/>
           </w:tcPr>
           <w:p>
+            <w:pPr>
+              <w:spacing w:before="40" w:after="40"/>
+            </w:pPr>
             <w:r>
               <w:rPr>
                 <w:sz w:val="19"/>
@@ -2779,9 +3172,12 @@
         </w:tc>
         <w:tc>
           <w:tcPr>
-            <w:tcW w:type="dxa" w:w="2160"/>
+            <w:tcW w:type="dxa" w:w="2340"/>
           </w:tcPr>
           <w:p>
+            <w:pPr>
+              <w:spacing w:before="40" w:after="40"/>
+            </w:pPr>
             <w:r>
               <w:rPr>
                 <w:sz w:val="19"/>
@@ -2797,9 +3193,12 @@
         </w:tc>
         <w:tc>
           <w:tcPr>
-            <w:tcW w:type="dxa" w:w="2160"/>
+            <w:tcW w:type="dxa" w:w="2340"/>
           </w:tcPr>
           <w:p>
+            <w:pPr>
+              <w:spacing w:before="40" w:after="40"/>
+            </w:pPr>
             <w:r>
               <w:rPr>
                 <w:sz w:val="19"/>
@@ -2817,9 +3216,12 @@
       <w:tr>
         <w:tc>
           <w:tcPr>
-            <w:tcW w:type="dxa" w:w="2160"/>
+            <w:tcW w:type="dxa" w:w="2340"/>
           </w:tcPr>
           <w:p>
+            <w:pPr>
+              <w:spacing w:before="40" w:after="40"/>
+            </w:pPr>
             <w:r>
               <w:rPr>
                 <w:sz w:val="19"/>
@@ -2835,9 +3237,12 @@
         </w:tc>
         <w:tc>
           <w:tcPr>
-            <w:tcW w:type="dxa" w:w="2160"/>
+            <w:tcW w:type="dxa" w:w="2340"/>
           </w:tcPr>
           <w:p>
+            <w:pPr>
+              <w:spacing w:before="40" w:after="40"/>
+            </w:pPr>
             <w:r>
               <w:rPr>
                 <w:sz w:val="19"/>
@@ -2853,9 +3258,12 @@
         </w:tc>
         <w:tc>
           <w:tcPr>
-            <w:tcW w:type="dxa" w:w="2160"/>
+            <w:tcW w:type="dxa" w:w="2340"/>
           </w:tcPr>
           <w:p>
+            <w:pPr>
+              <w:spacing w:before="40" w:after="40"/>
+            </w:pPr>
             <w:r>
               <w:rPr>
                 <w:sz w:val="19"/>
@@ -2871,9 +3279,12 @@
         </w:tc>
         <w:tc>
           <w:tcPr>
-            <w:tcW w:type="dxa" w:w="2160"/>
+            <w:tcW w:type="dxa" w:w="2340"/>
           </w:tcPr>
           <w:p>
+            <w:pPr>
+              <w:spacing w:before="40" w:after="40"/>
+            </w:pPr>
             <w:r>
               <w:rPr>
                 <w:sz w:val="19"/>
@@ -2891,9 +3302,12 @@
       <w:tr>
         <w:tc>
           <w:tcPr>
-            <w:tcW w:type="dxa" w:w="2160"/>
+            <w:tcW w:type="dxa" w:w="2340"/>
           </w:tcPr>
           <w:p>
+            <w:pPr>
+              <w:spacing w:before="40" w:after="40"/>
+            </w:pPr>
             <w:r>
               <w:rPr>
                 <w:sz w:val="19"/>
@@ -2909,9 +3323,12 @@
         </w:tc>
         <w:tc>
           <w:tcPr>
-            <w:tcW w:type="dxa" w:w="2160"/>
+            <w:tcW w:type="dxa" w:w="2340"/>
           </w:tcPr>
           <w:p>
+            <w:pPr>
+              <w:spacing w:before="40" w:after="40"/>
+            </w:pPr>
             <w:r>
               <w:rPr>
                 <w:sz w:val="19"/>
@@ -2927,9 +3344,12 @@
         </w:tc>
         <w:tc>
           <w:tcPr>
-            <w:tcW w:type="dxa" w:w="2160"/>
+            <w:tcW w:type="dxa" w:w="2340"/>
           </w:tcPr>
           <w:p>
+            <w:pPr>
+              <w:spacing w:before="40" w:after="40"/>
+            </w:pPr>
             <w:r>
               <w:rPr>
                 <w:sz w:val="19"/>
@@ -2945,9 +3365,12 @@
         </w:tc>
         <w:tc>
           <w:tcPr>
-            <w:tcW w:type="dxa" w:w="2160"/>
+            <w:tcW w:type="dxa" w:w="2340"/>
           </w:tcPr>
           <w:p>
+            <w:pPr>
+              <w:spacing w:before="40" w:after="40"/>
+            </w:pPr>
             <w:r>
               <w:rPr>
                 <w:sz w:val="19"/>
@@ -2965,9 +3388,12 @@
       <w:tr>
         <w:tc>
           <w:tcPr>
-            <w:tcW w:type="dxa" w:w="2160"/>
+            <w:tcW w:type="dxa" w:w="2340"/>
           </w:tcPr>
           <w:p>
+            <w:pPr>
+              <w:spacing w:before="40" w:after="40"/>
+            </w:pPr>
             <w:r>
               <w:rPr>
                 <w:sz w:val="19"/>
@@ -2983,9 +3409,12 @@
         </w:tc>
         <w:tc>
           <w:tcPr>
-            <w:tcW w:type="dxa" w:w="2160"/>
+            <w:tcW w:type="dxa" w:w="2340"/>
           </w:tcPr>
           <w:p>
+            <w:pPr>
+              <w:spacing w:before="40" w:after="40"/>
+            </w:pPr>
             <w:r>
               <w:rPr>
                 <w:sz w:val="19"/>
@@ -3001,9 +3430,12 @@
         </w:tc>
         <w:tc>
           <w:tcPr>
-            <w:tcW w:type="dxa" w:w="2160"/>
+            <w:tcW w:type="dxa" w:w="2340"/>
           </w:tcPr>
           <w:p>
+            <w:pPr>
+              <w:spacing w:before="40" w:after="40"/>
+            </w:pPr>
             <w:r>
               <w:rPr>
                 <w:sz w:val="19"/>
@@ -3013,9 +3445,12 @@
         </w:tc>
         <w:tc>
           <w:tcPr>
-            <w:tcW w:type="dxa" w:w="2160"/>
+            <w:tcW w:type="dxa" w:w="2340"/>
           </w:tcPr>
           <w:p>
+            <w:pPr>
+              <w:spacing w:before="40" w:after="40"/>
+            </w:pPr>
             <w:r>
               <w:rPr>
                 <w:sz w:val="19"/>
@@ -3027,9 +3462,12 @@
       <w:tr>
         <w:tc>
           <w:tcPr>
-            <w:tcW w:type="dxa" w:w="2160"/>
+            <w:tcW w:type="dxa" w:w="2340"/>
           </w:tcPr>
           <w:p>
+            <w:pPr>
+              <w:spacing w:before="40" w:after="40"/>
+            </w:pPr>
             <w:r>
               <w:rPr>
                 <w:sz w:val="19"/>
@@ -3045,9 +3483,12 @@
         </w:tc>
         <w:tc>
           <w:tcPr>
-            <w:tcW w:type="dxa" w:w="2160"/>
+            <w:tcW w:type="dxa" w:w="2340"/>
           </w:tcPr>
           <w:p>
+            <w:pPr>
+              <w:spacing w:before="40" w:after="40"/>
+            </w:pPr>
             <w:r>
               <w:rPr>
                 <w:sz w:val="19"/>
@@ -3063,9 +3504,12 @@
         </w:tc>
         <w:tc>
           <w:tcPr>
-            <w:tcW w:type="dxa" w:w="2160"/>
+            <w:tcW w:type="dxa" w:w="2340"/>
           </w:tcPr>
           <w:p>
+            <w:pPr>
+              <w:spacing w:before="40" w:after="40"/>
+            </w:pPr>
             <w:r>
               <w:rPr>
                 <w:sz w:val="19"/>
@@ -3075,9 +3519,12 @@
         </w:tc>
         <w:tc>
           <w:tcPr>
-            <w:tcW w:type="dxa" w:w="2160"/>
+            <w:tcW w:type="dxa" w:w="2340"/>
           </w:tcPr>
           <w:p>
+            <w:pPr>
+              <w:spacing w:before="40" w:after="40"/>
+            </w:pPr>
             <w:r>
               <w:rPr>
                 <w:sz w:val="19"/>
@@ -3089,9 +3536,12 @@
       <w:tr>
         <w:tc>
           <w:tcPr>
-            <w:tcW w:type="dxa" w:w="2160"/>
+            <w:tcW w:type="dxa" w:w="2340"/>
           </w:tcPr>
           <w:p>
+            <w:pPr>
+              <w:spacing w:before="40" w:after="40"/>
+            </w:pPr>
             <w:r>
               <w:rPr>
                 <w:sz w:val="19"/>
@@ -3107,9 +3557,12 @@
         </w:tc>
         <w:tc>
           <w:tcPr>
-            <w:tcW w:type="dxa" w:w="2160"/>
+            <w:tcW w:type="dxa" w:w="2340"/>
           </w:tcPr>
           <w:p>
+            <w:pPr>
+              <w:spacing w:before="40" w:after="40"/>
+            </w:pPr>
             <w:r>
               <w:rPr>
                 <w:sz w:val="19"/>
@@ -3125,9 +3578,12 @@
         </w:tc>
         <w:tc>
           <w:tcPr>
-            <w:tcW w:type="dxa" w:w="2160"/>
+            <w:tcW w:type="dxa" w:w="2340"/>
           </w:tcPr>
           <w:p>
+            <w:pPr>
+              <w:spacing w:before="40" w:after="40"/>
+            </w:pPr>
             <w:r>
               <w:rPr>
                 <w:sz w:val="19"/>
@@ -3137,9 +3593,12 @@
         </w:tc>
         <w:tc>
           <w:tcPr>
-            <w:tcW w:type="dxa" w:w="2160"/>
+            <w:tcW w:type="dxa" w:w="2340"/>
           </w:tcPr>
           <w:p>
+            <w:pPr>
+              <w:spacing w:before="40" w:after="40"/>
+            </w:pPr>
             <w:r>
               <w:rPr>
                 <w:sz w:val="19"/>
@@ -3158,25 +3617,6 @@
         <w:t>4. Triển khai</w:t>
       </w:r>
     </w:p>
-    <w:p>
-      <w:r>
-        <w:rPr>
-          <w:rFonts w:ascii="Consolas" w:hAnsi="Consolas"/>
-          <w:sz w:val="17"/>
-        </w:rPr>
-        <w:t>Internet ─► caddy ─┬─► web tĩnh (React build)</w:t>
-        <w:br/>
-        <w:t xml:space="preserve">                   └─► api (FastAPI ×2 worker) ─┬─► postgres</w:t>
-        <w:br/>
-        <w:t>bot (discord.js) ──────► api                    ├─► qdrant</w:t>
-        <w:br/>
-        <w:t xml:space="preserve">                                                ├─► redis</w:t>
-        <w:br/>
-        <w:t xml:space="preserve">                                                ├─► DeepSeek API</w:t>
-        <w:br/>
-        <w:t xml:space="preserve">                                                └─► DuckDuckGo (khi thiếu ngữ cảnh)</w:t>
-      </w:r>
-    </w:p>
     <w:tbl>
       <w:tblPr>
         <w:tblStyle w:val="TableGrid"/>
@@ -3184,17 +3624,63 @@
         <w:tblLook w:firstColumn="1" w:firstRow="1" w:lastColumn="0" w:lastRow="0" w:noHBand="0" w:noVBand="1" w:val="04A0"/>
       </w:tblPr>
       <w:tblGrid>
-        <w:gridCol w:w="2880"/>
-        <w:gridCol w:w="2880"/>
-        <w:gridCol w:w="2880"/>
+        <w:gridCol w:w="9360"/>
       </w:tblGrid>
       <w:tr>
         <w:tc>
           <w:tcPr>
-            <w:tcW w:type="dxa" w:w="2880"/>
+            <w:tcW w:type="dxa" w:w="9360"/>
+            <w:shd w:val="clear" w:color="auto" w:fill="F6F8FA"/>
+          </w:tcPr>
+          <w:p>
+            <w:pPr>
+              <w:spacing w:before="80" w:after="80" w:line="276" w:lineRule="auto"/>
+            </w:pPr>
+            <w:r/>
+            <w:r>
+              <w:rPr>
+                <w:rFonts w:ascii="Consolas" w:hAnsi="Consolas"/>
+                <w:color w:val="24292F"/>
+                <w:sz w:val="17"/>
+              </w:rPr>
+              <w:t>Internet ─► caddy ─┬─► web tĩnh (React build)</w:t>
+              <w:br/>
+              <w:t xml:space="preserve">                   └─► api (FastAPI ×2 worker) ─┬─► postgres</w:t>
+              <w:br/>
+              <w:t>bot (discord.js) ──────► api                    ├─► qdrant</w:t>
+              <w:br/>
+              <w:t xml:space="preserve">                                                ├─► redis</w:t>
+              <w:br/>
+              <w:t xml:space="preserve">                                                ├─► DeepSeek API</w:t>
+              <w:br/>
+              <w:t xml:space="preserve">                                                └─► DuckDuckGo (khi thiếu ngữ cảnh)</w:t>
+            </w:r>
+          </w:p>
+        </w:tc>
+      </w:tr>
+    </w:tbl>
+    <w:p/>
+    <w:tbl>
+      <w:tblPr>
+        <w:tblStyle w:val="TableGrid"/>
+        <w:tblW w:type="auto" w:w="0"/>
+        <w:tblLook w:firstColumn="1" w:firstRow="1" w:lastColumn="0" w:lastRow="0" w:noHBand="0" w:noVBand="1" w:val="04A0"/>
+      </w:tblPr>
+      <w:tblGrid>
+        <w:gridCol w:w="3120"/>
+        <w:gridCol w:w="3120"/>
+        <w:gridCol w:w="3120"/>
+      </w:tblGrid>
+      <w:tr>
+        <w:tc>
+          <w:tcPr>
+            <w:tcW w:type="dxa" w:w="3120"/>
             <w:shd w:val="clear" w:color="auto" w:fill="D9C48A"/>
           </w:tcPr>
           <w:p>
+            <w:pPr>
+              <w:spacing w:before="60" w:after="60"/>
+            </w:pPr>
             <w:r>
               <w:rPr>
                 <w:b/>
@@ -3212,10 +3698,13 @@
         </w:tc>
         <w:tc>
           <w:tcPr>
-            <w:tcW w:type="dxa" w:w="2880"/>
+            <w:tcW w:type="dxa" w:w="3120"/>
             <w:shd w:val="clear" w:color="auto" w:fill="D9C48A"/>
           </w:tcPr>
           <w:p>
+            <w:pPr>
+              <w:spacing w:before="60" w:after="60"/>
+            </w:pPr>
             <w:r>
               <w:rPr>
                 <w:b/>
@@ -3233,10 +3722,13 @@
         </w:tc>
         <w:tc>
           <w:tcPr>
-            <w:tcW w:type="dxa" w:w="2880"/>
+            <w:tcW w:type="dxa" w:w="3120"/>
             <w:shd w:val="clear" w:color="auto" w:fill="D9C48A"/>
           </w:tcPr>
           <w:p>
+            <w:pPr>
+              <w:spacing w:before="60" w:after="60"/>
+            </w:pPr>
             <w:r>
               <w:rPr>
                 <w:b/>
@@ -3257,9 +3749,12 @@
       <w:tr>
         <w:tc>
           <w:tcPr>
-            <w:tcW w:type="dxa" w:w="2880"/>
+            <w:tcW w:type="dxa" w:w="3120"/>
           </w:tcPr>
           <w:p>
+            <w:pPr>
+              <w:spacing w:before="40" w:after="40"/>
+            </w:pPr>
             <w:r>
               <w:rPr>
                 <w:sz w:val="19"/>
@@ -3275,9 +3770,12 @@
         </w:tc>
         <w:tc>
           <w:tcPr>
-            <w:tcW w:type="dxa" w:w="2880"/>
+            <w:tcW w:type="dxa" w:w="3120"/>
           </w:tcPr>
           <w:p>
+            <w:pPr>
+              <w:spacing w:before="40" w:after="40"/>
+            </w:pPr>
             <w:r>
               <w:rPr>
                 <w:sz w:val="19"/>
@@ -3294,9 +3792,12 @@
         </w:tc>
         <w:tc>
           <w:tcPr>
-            <w:tcW w:type="dxa" w:w="2880"/>
+            <w:tcW w:type="dxa" w:w="3120"/>
           </w:tcPr>
           <w:p>
+            <w:pPr>
+              <w:spacing w:before="40" w:after="40"/>
+            </w:pPr>
             <w:r>
               <w:rPr>
                 <w:sz w:val="19"/>
@@ -3314,9 +3815,12 @@
       <w:tr>
         <w:tc>
           <w:tcPr>
-            <w:tcW w:type="dxa" w:w="2880"/>
+            <w:tcW w:type="dxa" w:w="3120"/>
           </w:tcPr>
           <w:p>
+            <w:pPr>
+              <w:spacing w:before="40" w:after="40"/>
+            </w:pPr>
             <w:r>
               <w:rPr>
                 <w:sz w:val="19"/>
@@ -3332,9 +3836,12 @@
         </w:tc>
         <w:tc>
           <w:tcPr>
-            <w:tcW w:type="dxa" w:w="2880"/>
+            <w:tcW w:type="dxa" w:w="3120"/>
           </w:tcPr>
           <w:p>
+            <w:pPr>
+              <w:spacing w:before="40" w:after="40"/>
+            </w:pPr>
             <w:r>
               <w:rPr>
                 <w:sz w:val="19"/>
@@ -3351,9 +3858,12 @@
         </w:tc>
         <w:tc>
           <w:tcPr>
-            <w:tcW w:type="dxa" w:w="2880"/>
+            <w:tcW w:type="dxa" w:w="3120"/>
           </w:tcPr>
           <w:p>
+            <w:pPr>
+              <w:spacing w:before="40" w:after="40"/>
+            </w:pPr>
             <w:r>
               <w:rPr>
                 <w:sz w:val="19"/>
@@ -3371,9 +3881,12 @@
       <w:tr>
         <w:tc>
           <w:tcPr>
-            <w:tcW w:type="dxa" w:w="2880"/>
+            <w:tcW w:type="dxa" w:w="3120"/>
           </w:tcPr>
           <w:p>
+            <w:pPr>
+              <w:spacing w:before="40" w:after="40"/>
+            </w:pPr>
             <w:r>
               <w:rPr>
                 <w:sz w:val="19"/>
@@ -3389,9 +3902,12 @@
         </w:tc>
         <w:tc>
           <w:tcPr>
-            <w:tcW w:type="dxa" w:w="2880"/>
+            <w:tcW w:type="dxa" w:w="3120"/>
           </w:tcPr>
           <w:p>
+            <w:pPr>
+              <w:spacing w:before="40" w:after="40"/>
+            </w:pPr>
             <w:r>
               <w:rPr>
                 <w:sz w:val="19"/>
@@ -3408,9 +3924,12 @@
         </w:tc>
         <w:tc>
           <w:tcPr>
-            <w:tcW w:type="dxa" w:w="2880"/>
+            <w:tcW w:type="dxa" w:w="3120"/>
           </w:tcPr>
           <w:p>
+            <w:pPr>
+              <w:spacing w:before="40" w:after="40"/>
+            </w:pPr>
             <w:r>
               <w:rPr>
                 <w:sz w:val="19"/>
@@ -3428,9 +3947,12 @@
       <w:tr>
         <w:tc>
           <w:tcPr>
-            <w:tcW w:type="dxa" w:w="2880"/>
+            <w:tcW w:type="dxa" w:w="3120"/>
           </w:tcPr>
           <w:p>
+            <w:pPr>
+              <w:spacing w:before="40" w:after="40"/>
+            </w:pPr>
             <w:r>
               <w:rPr>
                 <w:sz w:val="19"/>
@@ -3446,9 +3968,12 @@
         </w:tc>
         <w:tc>
           <w:tcPr>
-            <w:tcW w:type="dxa" w:w="2880"/>
+            <w:tcW w:type="dxa" w:w="3120"/>
           </w:tcPr>
           <w:p>
+            <w:pPr>
+              <w:spacing w:before="40" w:after="40"/>
+            </w:pPr>
             <w:r>
               <w:rPr>
                 <w:sz w:val="19"/>
@@ -3465,9 +3990,12 @@
         </w:tc>
         <w:tc>
           <w:tcPr>
-            <w:tcW w:type="dxa" w:w="2880"/>
+            <w:tcW w:type="dxa" w:w="3120"/>
           </w:tcPr>
           <w:p>
+            <w:pPr>
+              <w:spacing w:before="40" w:after="40"/>
+            </w:pPr>
             <w:r>
               <w:rPr>
                 <w:sz w:val="19"/>
@@ -3485,9 +4013,12 @@
       <w:tr>
         <w:tc>
           <w:tcPr>
-            <w:tcW w:type="dxa" w:w="2880"/>
+            <w:tcW w:type="dxa" w:w="3120"/>
           </w:tcPr>
           <w:p>
+            <w:pPr>
+              <w:spacing w:before="40" w:after="40"/>
+            </w:pPr>
             <w:r>
               <w:rPr>
                 <w:sz w:val="19"/>
@@ -3503,9 +4034,12 @@
         </w:tc>
         <w:tc>
           <w:tcPr>
-            <w:tcW w:type="dxa" w:w="2880"/>
+            <w:tcW w:type="dxa" w:w="3120"/>
           </w:tcPr>
           <w:p>
+            <w:pPr>
+              <w:spacing w:before="40" w:after="40"/>
+            </w:pPr>
             <w:r>
               <w:rPr>
                 <w:sz w:val="19"/>
@@ -3554,9 +4088,12 @@
         </w:tc>
         <w:tc>
           <w:tcPr>
-            <w:tcW w:type="dxa" w:w="2880"/>
+            <w:tcW w:type="dxa" w:w="3120"/>
           </w:tcPr>
           <w:p>
+            <w:pPr>
+              <w:spacing w:before="40" w:after="40"/>
+            </w:pPr>
             <w:r>
               <w:rPr>
                 <w:sz w:val="19"/>
@@ -3574,9 +4111,12 @@
       <w:tr>
         <w:tc>
           <w:tcPr>
-            <w:tcW w:type="dxa" w:w="2880"/>
+            <w:tcW w:type="dxa" w:w="3120"/>
           </w:tcPr>
           <w:p>
+            <w:pPr>
+              <w:spacing w:before="40" w:after="40"/>
+            </w:pPr>
             <w:r>
               <w:rPr>
                 <w:sz w:val="19"/>
@@ -3592,9 +4132,12 @@
         </w:tc>
         <w:tc>
           <w:tcPr>
-            <w:tcW w:type="dxa" w:w="2880"/>
+            <w:tcW w:type="dxa" w:w="3120"/>
           </w:tcPr>
           <w:p>
+            <w:pPr>
+              <w:spacing w:before="40" w:after="40"/>
+            </w:pPr>
             <w:r>
               <w:rPr>
                 <w:sz w:val="19"/>
@@ -3611,9 +4154,12 @@
         </w:tc>
         <w:tc>
           <w:tcPr>
-            <w:tcW w:type="dxa" w:w="2880"/>
+            <w:tcW w:type="dxa" w:w="3120"/>
           </w:tcPr>
           <w:p>
+            <w:pPr>
+              <w:spacing w:before="40" w:after="40"/>
+            </w:pPr>
             <w:r>
               <w:rPr>
                 <w:sz w:val="19"/>
@@ -3631,9 +4177,12 @@
       <w:tr>
         <w:tc>
           <w:tcPr>
-            <w:tcW w:type="dxa" w:w="2880"/>
+            <w:tcW w:type="dxa" w:w="3120"/>
           </w:tcPr>
           <w:p>
+            <w:pPr>
+              <w:spacing w:before="40" w:after="40"/>
+            </w:pPr>
             <w:r>
               <w:rPr>
                 <w:sz w:val="19"/>
@@ -3649,9 +4198,12 @@
         </w:tc>
         <w:tc>
           <w:tcPr>
-            <w:tcW w:type="dxa" w:w="2880"/>
+            <w:tcW w:type="dxa" w:w="3120"/>
           </w:tcPr>
           <w:p>
+            <w:pPr>
+              <w:spacing w:before="40" w:after="40"/>
+            </w:pPr>
             <w:r>
               <w:rPr>
                 <w:sz w:val="19"/>
@@ -3667,9 +4219,12 @@
         </w:tc>
         <w:tc>
           <w:tcPr>
-            <w:tcW w:type="dxa" w:w="2880"/>
+            <w:tcW w:type="dxa" w:w="3120"/>
           </w:tcPr>
           <w:p>
+            <w:pPr>
+              <w:spacing w:before="40" w:after="40"/>
+            </w:pPr>
             <w:r>
               <w:rPr>
                 <w:sz w:val="19"/>
@@ -3687,9 +4242,12 @@
       <w:tr>
         <w:tc>
           <w:tcPr>
-            <w:tcW w:type="dxa" w:w="2880"/>
+            <w:tcW w:type="dxa" w:w="3120"/>
           </w:tcPr>
           <w:p>
+            <w:pPr>
+              <w:spacing w:before="40" w:after="40"/>
+            </w:pPr>
             <w:r>
               <w:rPr>
                 <w:sz w:val="19"/>
@@ -3706,9 +4264,12 @@
         </w:tc>
         <w:tc>
           <w:tcPr>
-            <w:tcW w:type="dxa" w:w="2880"/>
+            <w:tcW w:type="dxa" w:w="3120"/>
           </w:tcPr>
           <w:p>
+            <w:pPr>
+              <w:spacing w:before="40" w:after="40"/>
+            </w:pPr>
             <w:r>
               <w:rPr>
                 <w:sz w:val="19"/>
@@ -3718,9 +4279,12 @@
         </w:tc>
         <w:tc>
           <w:tcPr>
-            <w:tcW w:type="dxa" w:w="2880"/>
+            <w:tcW w:type="dxa" w:w="3120"/>
           </w:tcPr>
           <w:p>
+            <w:pPr>
+              <w:spacing w:before="40" w:after="40"/>
+            </w:pPr>
             <w:r>
               <w:rPr>
                 <w:sz w:val="19"/>
@@ -3739,6 +4303,9 @@
     </w:tbl>
     <w:p/>
     <w:p>
+      <w:pPr>
+        <w:spacing w:before="20" w:after="60"/>
+      </w:pPr>
       <w:r>
         <w:t xml:space="preserve">Model ONNX tải sẵn vào </w:t>
       </w:r>
@@ -3768,16 +4335,19 @@
         <w:tblLook w:firstColumn="1" w:firstRow="1" w:lastColumn="0" w:lastRow="0" w:noHBand="0" w:noVBand="1" w:val="04A0"/>
       </w:tblPr>
       <w:tblGrid>
-        <w:gridCol w:w="4320"/>
-        <w:gridCol w:w="4320"/>
+        <w:gridCol w:w="4680"/>
+        <w:gridCol w:w="4680"/>
       </w:tblGrid>
       <w:tr>
         <w:tc>
           <w:tcPr>
-            <w:tcW w:type="dxa" w:w="4320"/>
+            <w:tcW w:type="dxa" w:w="4680"/>
             <w:shd w:val="clear" w:color="auto" w:fill="D9C48A"/>
           </w:tcPr>
           <w:p>
+            <w:pPr>
+              <w:spacing w:before="60" w:after="60"/>
+            </w:pPr>
             <w:r>
               <w:rPr>
                 <w:b/>
@@ -3795,10 +4365,13 @@
         </w:tc>
         <w:tc>
           <w:tcPr>
-            <w:tcW w:type="dxa" w:w="4320"/>
+            <w:tcW w:type="dxa" w:w="4680"/>
             <w:shd w:val="clear" w:color="auto" w:fill="D9C48A"/>
           </w:tcPr>
           <w:p>
+            <w:pPr>
+              <w:spacing w:before="60" w:after="60"/>
+            </w:pPr>
             <w:r>
               <w:rPr>
                 <w:b/>
@@ -3818,9 +4391,12 @@
       <w:tr>
         <w:tc>
           <w:tcPr>
-            <w:tcW w:type="dxa" w:w="4320"/>
+            <w:tcW w:type="dxa" w:w="4680"/>
           </w:tcPr>
           <w:p>
+            <w:pPr>
+              <w:spacing w:before="40" w:after="40"/>
+            </w:pPr>
             <w:r>
               <w:rPr>
                 <w:sz w:val="19"/>
@@ -3836,9 +4412,12 @@
         </w:tc>
         <w:tc>
           <w:tcPr>
-            <w:tcW w:type="dxa" w:w="4320"/>
+            <w:tcW w:type="dxa" w:w="4680"/>
           </w:tcPr>
           <w:p>
+            <w:pPr>
+              <w:spacing w:before="40" w:after="40"/>
+            </w:pPr>
             <w:r>
               <w:rPr>
                 <w:sz w:val="19"/>
@@ -3856,9 +4435,12 @@
       <w:tr>
         <w:tc>
           <w:tcPr>
-            <w:tcW w:type="dxa" w:w="4320"/>
+            <w:tcW w:type="dxa" w:w="4680"/>
           </w:tcPr>
           <w:p>
+            <w:pPr>
+              <w:spacing w:before="40" w:after="40"/>
+            </w:pPr>
             <w:r>
               <w:rPr>
                 <w:sz w:val="19"/>
@@ -3874,9 +4456,12 @@
         </w:tc>
         <w:tc>
           <w:tcPr>
-            <w:tcW w:type="dxa" w:w="4320"/>
+            <w:tcW w:type="dxa" w:w="4680"/>
           </w:tcPr>
           <w:p>
+            <w:pPr>
+              <w:spacing w:before="40" w:after="40"/>
+            </w:pPr>
             <w:r>
               <w:rPr>
                 <w:sz w:val="19"/>
@@ -3894,9 +4479,12 @@
       <w:tr>
         <w:tc>
           <w:tcPr>
-            <w:tcW w:type="dxa" w:w="4320"/>
+            <w:tcW w:type="dxa" w:w="4680"/>
           </w:tcPr>
           <w:p>
+            <w:pPr>
+              <w:spacing w:before="40" w:after="40"/>
+            </w:pPr>
             <w:r>
               <w:rPr>
                 <w:sz w:val="19"/>
@@ -3912,9 +4500,12 @@
         </w:tc>
         <w:tc>
           <w:tcPr>
-            <w:tcW w:type="dxa" w:w="4320"/>
+            <w:tcW w:type="dxa" w:w="4680"/>
           </w:tcPr>
           <w:p>
+            <w:pPr>
+              <w:spacing w:before="40" w:after="40"/>
+            </w:pPr>
             <w:r>
               <w:rPr>
                 <w:sz w:val="19"/>
@@ -3932,9 +4523,12 @@
       <w:tr>
         <w:tc>
           <w:tcPr>
-            <w:tcW w:type="dxa" w:w="4320"/>
+            <w:tcW w:type="dxa" w:w="4680"/>
           </w:tcPr>
           <w:p>
+            <w:pPr>
+              <w:spacing w:before="40" w:after="40"/>
+            </w:pPr>
             <w:r>
               <w:rPr>
                 <w:sz w:val="19"/>
@@ -3950,9 +4544,12 @@
         </w:tc>
         <w:tc>
           <w:tcPr>
-            <w:tcW w:type="dxa" w:w="4320"/>
+            <w:tcW w:type="dxa" w:w="4680"/>
           </w:tcPr>
           <w:p>
+            <w:pPr>
+              <w:spacing w:before="40" w:after="40"/>
+            </w:pPr>
             <w:r>
               <w:rPr>
                 <w:sz w:val="19"/>
@@ -3970,9 +4567,12 @@
       <w:tr>
         <w:tc>
           <w:tcPr>
-            <w:tcW w:type="dxa" w:w="4320"/>
+            <w:tcW w:type="dxa" w:w="4680"/>
           </w:tcPr>
           <w:p>
+            <w:pPr>
+              <w:spacing w:before="40" w:after="40"/>
+            </w:pPr>
             <w:r>
               <w:rPr>
                 <w:sz w:val="19"/>
@@ -3988,9 +4588,12 @@
         </w:tc>
         <w:tc>
           <w:tcPr>
-            <w:tcW w:type="dxa" w:w="4320"/>
+            <w:tcW w:type="dxa" w:w="4680"/>
           </w:tcPr>
           <w:p>
+            <w:pPr>
+              <w:spacing w:before="40" w:after="40"/>
+            </w:pPr>
             <w:r>
               <w:rPr>
                 <w:sz w:val="19"/>
@@ -4008,6 +4611,9 @@
     </w:tbl>
     <w:p/>
     <w:p>
+      <w:pPr>
+        <w:spacing w:before="20" w:after="60"/>
+      </w:pPr>
       <w:r>
         <w:t xml:space="preserve">Giá </w:t>
       </w:r>
@@ -4037,17 +4643,20 @@
         <w:tblLook w:firstColumn="1" w:firstRow="1" w:lastColumn="0" w:lastRow="0" w:noHBand="0" w:noVBand="1" w:val="04A0"/>
       </w:tblPr>
       <w:tblGrid>
-        <w:gridCol w:w="2880"/>
-        <w:gridCol w:w="2880"/>
-        <w:gridCol w:w="2880"/>
+        <w:gridCol w:w="3120"/>
+        <w:gridCol w:w="3120"/>
+        <w:gridCol w:w="3120"/>
       </w:tblGrid>
       <w:tr>
         <w:tc>
           <w:tcPr>
-            <w:tcW w:type="dxa" w:w="2880"/>
+            <w:tcW w:type="dxa" w:w="3120"/>
             <w:shd w:val="clear" w:color="auto" w:fill="D9C48A"/>
           </w:tcPr>
           <w:p>
+            <w:pPr>
+              <w:spacing w:before="60" w:after="60"/>
+            </w:pPr>
             <w:r>
               <w:rPr>
                 <w:b/>
@@ -4065,10 +4674,13 @@
         </w:tc>
         <w:tc>
           <w:tcPr>
-            <w:tcW w:type="dxa" w:w="2880"/>
+            <w:tcW w:type="dxa" w:w="3120"/>
             <w:shd w:val="clear" w:color="auto" w:fill="D9C48A"/>
           </w:tcPr>
           <w:p>
+            <w:pPr>
+              <w:spacing w:before="60" w:after="60"/>
+            </w:pPr>
             <w:r>
               <w:rPr>
                 <w:b/>
@@ -4086,10 +4698,13 @@
         </w:tc>
         <w:tc>
           <w:tcPr>
-            <w:tcW w:type="dxa" w:w="2880"/>
+            <w:tcW w:type="dxa" w:w="3120"/>
             <w:shd w:val="clear" w:color="auto" w:fill="D9C48A"/>
           </w:tcPr>
           <w:p>
+            <w:pPr>
+              <w:spacing w:before="60" w:after="60"/>
+            </w:pPr>
             <w:r>
               <w:rPr>
                 <w:b/>
@@ -4109,9 +4724,12 @@
       <w:tr>
         <w:tc>
           <w:tcPr>
-            <w:tcW w:type="dxa" w:w="2880"/>
+            <w:tcW w:type="dxa" w:w="3120"/>
           </w:tcPr>
           <w:p>
+            <w:pPr>
+              <w:spacing w:before="40" w:after="40"/>
+            </w:pPr>
             <w:r>
               <w:rPr>
                 <w:sz w:val="19"/>
@@ -4127,9 +4745,12 @@
         </w:tc>
         <w:tc>
           <w:tcPr>
-            <w:tcW w:type="dxa" w:w="2880"/>
+            <w:tcW w:type="dxa" w:w="3120"/>
           </w:tcPr>
           <w:p>
+            <w:pPr>
+              <w:spacing w:before="40" w:after="40"/>
+            </w:pPr>
             <w:r>
               <w:rPr>
                 <w:sz w:val="19"/>
@@ -4145,9 +4766,12 @@
         </w:tc>
         <w:tc>
           <w:tcPr>
-            <w:tcW w:type="dxa" w:w="2880"/>
+            <w:tcW w:type="dxa" w:w="3120"/>
           </w:tcPr>
           <w:p>
+            <w:pPr>
+              <w:spacing w:before="40" w:after="40"/>
+            </w:pPr>
             <w:r>
               <w:rPr>
                 <w:sz w:val="19"/>
@@ -4165,9 +4789,12 @@
       <w:tr>
         <w:tc>
           <w:tcPr>
-            <w:tcW w:type="dxa" w:w="2880"/>
+            <w:tcW w:type="dxa" w:w="3120"/>
           </w:tcPr>
           <w:p>
+            <w:pPr>
+              <w:spacing w:before="40" w:after="40"/>
+            </w:pPr>
             <w:r>
               <w:rPr>
                 <w:sz w:val="19"/>
@@ -4183,9 +4810,12 @@
         </w:tc>
         <w:tc>
           <w:tcPr>
-            <w:tcW w:type="dxa" w:w="2880"/>
+            <w:tcW w:type="dxa" w:w="3120"/>
           </w:tcPr>
           <w:p>
+            <w:pPr>
+              <w:spacing w:before="40" w:after="40"/>
+            </w:pPr>
             <w:r>
               <w:rPr>
                 <w:sz w:val="19"/>
@@ -4201,9 +4831,12 @@
         </w:tc>
         <w:tc>
           <w:tcPr>
-            <w:tcW w:type="dxa" w:w="2880"/>
+            <w:tcW w:type="dxa" w:w="3120"/>
           </w:tcPr>
           <w:p>
+            <w:pPr>
+              <w:spacing w:before="40" w:after="40"/>
+            </w:pPr>
             <w:r>
               <w:rPr>
                 <w:sz w:val="19"/>
@@ -4221,9 +4854,12 @@
       <w:tr>
         <w:tc>
           <w:tcPr>
-            <w:tcW w:type="dxa" w:w="2880"/>
+            <w:tcW w:type="dxa" w:w="3120"/>
           </w:tcPr>
           <w:p>
+            <w:pPr>
+              <w:spacing w:before="40" w:after="40"/>
+            </w:pPr>
             <w:r>
               <w:rPr>
                 <w:sz w:val="19"/>
@@ -4239,9 +4875,12 @@
         </w:tc>
         <w:tc>
           <w:tcPr>
-            <w:tcW w:type="dxa" w:w="2880"/>
+            <w:tcW w:type="dxa" w:w="3120"/>
           </w:tcPr>
           <w:p>
+            <w:pPr>
+              <w:spacing w:before="40" w:after="40"/>
+            </w:pPr>
             <w:r>
               <w:rPr>
                 <w:sz w:val="19"/>
@@ -4257,9 +4896,12 @@
         </w:tc>
         <w:tc>
           <w:tcPr>
-            <w:tcW w:type="dxa" w:w="2880"/>
+            <w:tcW w:type="dxa" w:w="3120"/>
           </w:tcPr>
           <w:p>
+            <w:pPr>
+              <w:spacing w:before="40" w:after="40"/>
+            </w:pPr>
             <w:r>
               <w:rPr>
                 <w:sz w:val="19"/>
@@ -4277,6 +4919,9 @@
     </w:tbl>
     <w:p/>
     <w:p>
+      <w:pPr>
+        <w:spacing w:before="20" w:after="60"/>
+      </w:pPr>
       <w:r>
         <w:t>Thu thập và index lore base game (</w:t>
       </w:r>
@@ -4292,6 +4937,9 @@
       </w:r>
     </w:p>
     <w:p>
+      <w:pPr>
+        <w:spacing w:before="20" w:after="60"/>
+      </w:pPr>
       <w:r>
         <w:t>Không crawl Fandom và Fextralife. Giới hạn crawl ≤ 1 request/giây, User-Agent có email liên hệ.</w:t>
       </w:r>
@@ -4311,16 +4959,19 @@
         <w:tblLook w:firstColumn="1" w:firstRow="1" w:lastColumn="0" w:lastRow="0" w:noHBand="0" w:noVBand="1" w:val="04A0"/>
       </w:tblPr>
       <w:tblGrid>
-        <w:gridCol w:w="4320"/>
-        <w:gridCol w:w="4320"/>
+        <w:gridCol w:w="4680"/>
+        <w:gridCol w:w="4680"/>
       </w:tblGrid>
       <w:tr>
         <w:tc>
           <w:tcPr>
-            <w:tcW w:type="dxa" w:w="4320"/>
+            <w:tcW w:type="dxa" w:w="4680"/>
             <w:shd w:val="clear" w:color="auto" w:fill="D9C48A"/>
           </w:tcPr>
           <w:p>
+            <w:pPr>
+              <w:spacing w:before="60" w:after="60"/>
+            </w:pPr>
             <w:r>
               <w:rPr>
                 <w:b/>
@@ -4338,10 +4989,13 @@
         </w:tc>
         <w:tc>
           <w:tcPr>
-            <w:tcW w:type="dxa" w:w="4320"/>
+            <w:tcW w:type="dxa" w:w="4680"/>
             <w:shd w:val="clear" w:color="auto" w:fill="D9C48A"/>
           </w:tcPr>
           <w:p>
+            <w:pPr>
+              <w:spacing w:before="60" w:after="60"/>
+            </w:pPr>
             <w:r>
               <w:rPr>
                 <w:b/>
@@ -4361,9 +5015,12 @@
       <w:tr>
         <w:tc>
           <w:tcPr>
-            <w:tcW w:type="dxa" w:w="4320"/>
+            <w:tcW w:type="dxa" w:w="4680"/>
           </w:tcPr>
           <w:p>
+            <w:pPr>
+              <w:spacing w:before="40" w:after="40"/>
+            </w:pPr>
             <w:r>
               <w:rPr>
                 <w:sz w:val="19"/>
@@ -4379,9 +5036,12 @@
         </w:tc>
         <w:tc>
           <w:tcPr>
-            <w:tcW w:type="dxa" w:w="4320"/>
+            <w:tcW w:type="dxa" w:w="4680"/>
           </w:tcPr>
           <w:p>
+            <w:pPr>
+              <w:spacing w:before="40" w:after="40"/>
+            </w:pPr>
             <w:r>
               <w:rPr>
                 <w:sz w:val="19"/>
@@ -4399,9 +5059,12 @@
       <w:tr>
         <w:tc>
           <w:tcPr>
-            <w:tcW w:type="dxa" w:w="4320"/>
+            <w:tcW w:type="dxa" w:w="4680"/>
           </w:tcPr>
           <w:p>
+            <w:pPr>
+              <w:spacing w:before="40" w:after="40"/>
+            </w:pPr>
             <w:r>
               <w:rPr>
                 <w:sz w:val="19"/>
@@ -4417,9 +5080,12 @@
         </w:tc>
         <w:tc>
           <w:tcPr>
-            <w:tcW w:type="dxa" w:w="4320"/>
+            <w:tcW w:type="dxa" w:w="4680"/>
           </w:tcPr>
           <w:p>
+            <w:pPr>
+              <w:spacing w:before="40" w:after="40"/>
+            </w:pPr>
             <w:r>
               <w:rPr>
                 <w:sz w:val="19"/>
@@ -4450,9 +5116,12 @@
       <w:tr>
         <w:tc>
           <w:tcPr>
-            <w:tcW w:type="dxa" w:w="4320"/>
+            <w:tcW w:type="dxa" w:w="4680"/>
           </w:tcPr>
           <w:p>
+            <w:pPr>
+              <w:spacing w:before="40" w:after="40"/>
+            </w:pPr>
             <w:r>
               <w:rPr>
                 <w:sz w:val="19"/>
@@ -4468,9 +5137,12 @@
         </w:tc>
         <w:tc>
           <w:tcPr>
-            <w:tcW w:type="dxa" w:w="4320"/>
+            <w:tcW w:type="dxa" w:w="4680"/>
           </w:tcPr>
           <w:p>
+            <w:pPr>
+              <w:spacing w:before="40" w:after="40"/>
+            </w:pPr>
             <w:r>
               <w:rPr>
                 <w:sz w:val="19"/>
@@ -4501,9 +5173,12 @@
       <w:tr>
         <w:tc>
           <w:tcPr>
-            <w:tcW w:type="dxa" w:w="4320"/>
+            <w:tcW w:type="dxa" w:w="4680"/>
           </w:tcPr>
           <w:p>
+            <w:pPr>
+              <w:spacing w:before="40" w:after="40"/>
+            </w:pPr>
             <w:r>
               <w:rPr>
                 <w:sz w:val="19"/>
@@ -4519,9 +5194,12 @@
         </w:tc>
         <w:tc>
           <w:tcPr>
-            <w:tcW w:type="dxa" w:w="4320"/>
+            <w:tcW w:type="dxa" w:w="4680"/>
           </w:tcPr>
           <w:p>
+            <w:pPr>
+              <w:spacing w:before="40" w:after="40"/>
+            </w:pPr>
             <w:r>
               <w:rPr>
                 <w:sz w:val="19"/>
@@ -4560,17 +5238,20 @@
         <w:tblLook w:firstColumn="1" w:firstRow="1" w:lastColumn="0" w:lastRow="0" w:noHBand="0" w:noVBand="1" w:val="04A0"/>
       </w:tblPr>
       <w:tblGrid>
-        <w:gridCol w:w="2880"/>
-        <w:gridCol w:w="2880"/>
-        <w:gridCol w:w="2880"/>
+        <w:gridCol w:w="3120"/>
+        <w:gridCol w:w="3120"/>
+        <w:gridCol w:w="3120"/>
       </w:tblGrid>
       <w:tr>
         <w:tc>
           <w:tcPr>
-            <w:tcW w:type="dxa" w:w="2880"/>
+            <w:tcW w:type="dxa" w:w="3120"/>
             <w:shd w:val="clear" w:color="auto" w:fill="D9C48A"/>
           </w:tcPr>
           <w:p>
+            <w:pPr>
+              <w:spacing w:before="60" w:after="60"/>
+            </w:pPr>
             <w:r>
               <w:rPr>
                 <w:b/>
@@ -4588,10 +5269,13 @@
         </w:tc>
         <w:tc>
           <w:tcPr>
-            <w:tcW w:type="dxa" w:w="2880"/>
+            <w:tcW w:type="dxa" w:w="3120"/>
             <w:shd w:val="clear" w:color="auto" w:fill="D9C48A"/>
           </w:tcPr>
           <w:p>
+            <w:pPr>
+              <w:spacing w:before="60" w:after="60"/>
+            </w:pPr>
             <w:r>
               <w:rPr>
                 <w:b/>
@@ -4609,10 +5293,13 @@
         </w:tc>
         <w:tc>
           <w:tcPr>
-            <w:tcW w:type="dxa" w:w="2880"/>
+            <w:tcW w:type="dxa" w:w="3120"/>
             <w:shd w:val="clear" w:color="auto" w:fill="D9C48A"/>
           </w:tcPr>
           <w:p>
+            <w:pPr>
+              <w:spacing w:before="60" w:after="60"/>
+            </w:pPr>
             <w:r>
               <w:rPr>
                 <w:b/>
@@ -4632,9 +5319,12 @@
       <w:tr>
         <w:tc>
           <w:tcPr>
-            <w:tcW w:type="dxa" w:w="2880"/>
+            <w:tcW w:type="dxa" w:w="3120"/>
           </w:tcPr>
           <w:p>
+            <w:pPr>
+              <w:spacing w:before="40" w:after="40"/>
+            </w:pPr>
             <w:r>
               <w:rPr>
                 <w:sz w:val="19"/>
@@ -4650,9 +5340,12 @@
         </w:tc>
         <w:tc>
           <w:tcPr>
-            <w:tcW w:type="dxa" w:w="2880"/>
+            <w:tcW w:type="dxa" w:w="3120"/>
           </w:tcPr>
           <w:p>
+            <w:pPr>
+              <w:spacing w:before="40" w:after="40"/>
+            </w:pPr>
             <w:r>
               <w:rPr>
                 <w:sz w:val="19"/>
@@ -4688,9 +5381,12 @@
         </w:tc>
         <w:tc>
           <w:tcPr>
-            <w:tcW w:type="dxa" w:w="2880"/>
+            <w:tcW w:type="dxa" w:w="3120"/>
           </w:tcPr>
           <w:p>
+            <w:pPr>
+              <w:spacing w:before="40" w:after="40"/>
+            </w:pPr>
             <w:r>
               <w:rPr>
                 <w:sz w:val="19"/>
@@ -4708,9 +5404,12 @@
       <w:tr>
         <w:tc>
           <w:tcPr>
-            <w:tcW w:type="dxa" w:w="2880"/>
+            <w:tcW w:type="dxa" w:w="3120"/>
           </w:tcPr>
           <w:p>
+            <w:pPr>
+              <w:spacing w:before="40" w:after="40"/>
+            </w:pPr>
             <w:r>
               <w:rPr>
                 <w:sz w:val="19"/>
@@ -4726,9 +5425,12 @@
         </w:tc>
         <w:tc>
           <w:tcPr>
-            <w:tcW w:type="dxa" w:w="2880"/>
+            <w:tcW w:type="dxa" w:w="3120"/>
           </w:tcPr>
           <w:p>
+            <w:pPr>
+              <w:spacing w:before="40" w:after="40"/>
+            </w:pPr>
             <w:r>
               <w:rPr>
                 <w:sz w:val="19"/>
@@ -4757,9 +5459,12 @@
         </w:tc>
         <w:tc>
           <w:tcPr>
-            <w:tcW w:type="dxa" w:w="2880"/>
+            <w:tcW w:type="dxa" w:w="3120"/>
           </w:tcPr>
           <w:p>
+            <w:pPr>
+              <w:spacing w:before="40" w:after="40"/>
+            </w:pPr>
             <w:r>
               <w:rPr>
                 <w:sz w:val="19"/>
@@ -4777,9 +5482,12 @@
       <w:tr>
         <w:tc>
           <w:tcPr>
-            <w:tcW w:type="dxa" w:w="2880"/>
+            <w:tcW w:type="dxa" w:w="3120"/>
           </w:tcPr>
           <w:p>
+            <w:pPr>
+              <w:spacing w:before="40" w:after="40"/>
+            </w:pPr>
             <w:r>
               <w:rPr>
                 <w:sz w:val="19"/>
@@ -4795,9 +5503,12 @@
         </w:tc>
         <w:tc>
           <w:tcPr>
-            <w:tcW w:type="dxa" w:w="2880"/>
+            <w:tcW w:type="dxa" w:w="3120"/>
           </w:tcPr>
           <w:p>
+            <w:pPr>
+              <w:spacing w:before="40" w:after="40"/>
+            </w:pPr>
             <w:r>
               <w:rPr>
                 <w:sz w:val="19"/>
@@ -4813,9 +5524,12 @@
         </w:tc>
         <w:tc>
           <w:tcPr>
-            <w:tcW w:type="dxa" w:w="2880"/>
+            <w:tcW w:type="dxa" w:w="3120"/>
           </w:tcPr>
           <w:p>
+            <w:pPr>
+              <w:spacing w:before="40" w:after="40"/>
+            </w:pPr>
             <w:r>
               <w:rPr>
                 <w:sz w:val="19"/>
@@ -4833,9 +5547,12 @@
       <w:tr>
         <w:tc>
           <w:tcPr>
-            <w:tcW w:type="dxa" w:w="2880"/>
+            <w:tcW w:type="dxa" w:w="3120"/>
           </w:tcPr>
           <w:p>
+            <w:pPr>
+              <w:spacing w:before="40" w:after="40"/>
+            </w:pPr>
             <w:r>
               <w:rPr>
                 <w:sz w:val="19"/>
@@ -4851,9 +5568,12 @@
         </w:tc>
         <w:tc>
           <w:tcPr>
-            <w:tcW w:type="dxa" w:w="2880"/>
+            <w:tcW w:type="dxa" w:w="3120"/>
           </w:tcPr>
           <w:p>
+            <w:pPr>
+              <w:spacing w:before="40" w:after="40"/>
+            </w:pPr>
             <w:r>
               <w:rPr>
                 <w:sz w:val="19"/>
@@ -4869,9 +5589,12 @@
         </w:tc>
         <w:tc>
           <w:tcPr>
-            <w:tcW w:type="dxa" w:w="2880"/>
+            <w:tcW w:type="dxa" w:w="3120"/>
           </w:tcPr>
           <w:p>
+            <w:pPr>
+              <w:spacing w:before="40" w:after="40"/>
+            </w:pPr>
             <w:r>
               <w:rPr>
                 <w:sz w:val="19"/>
@@ -4889,9 +5612,12 @@
       <w:tr>
         <w:tc>
           <w:tcPr>
-            <w:tcW w:type="dxa" w:w="2880"/>
+            <w:tcW w:type="dxa" w:w="3120"/>
           </w:tcPr>
           <w:p>
+            <w:pPr>
+              <w:spacing w:before="40" w:after="40"/>
+            </w:pPr>
             <w:r>
               <w:rPr>
                 <w:sz w:val="19"/>
@@ -4907,9 +5633,12 @@
         </w:tc>
         <w:tc>
           <w:tcPr>
-            <w:tcW w:type="dxa" w:w="2880"/>
+            <w:tcW w:type="dxa" w:w="3120"/>
           </w:tcPr>
           <w:p>
+            <w:pPr>
+              <w:spacing w:before="40" w:after="40"/>
+            </w:pPr>
             <w:r>
               <w:rPr>
                 <w:sz w:val="19"/>
@@ -4925,9 +5654,12 @@
         </w:tc>
         <w:tc>
           <w:tcPr>
-            <w:tcW w:type="dxa" w:w="2880"/>
+            <w:tcW w:type="dxa" w:w="3120"/>
           </w:tcPr>
           <w:p>
+            <w:pPr>
+              <w:spacing w:before="40" w:after="40"/>
+            </w:pPr>
             <w:r>
               <w:rPr>
                 <w:sz w:val="19"/>
@@ -4945,9 +5677,12 @@
       <w:tr>
         <w:tc>
           <w:tcPr>
-            <w:tcW w:type="dxa" w:w="2880"/>
+            <w:tcW w:type="dxa" w:w="3120"/>
           </w:tcPr>
           <w:p>
+            <w:pPr>
+              <w:spacing w:before="40" w:after="40"/>
+            </w:pPr>
             <w:r>
               <w:rPr>
                 <w:sz w:val="19"/>
@@ -4963,9 +5698,12 @@
         </w:tc>
         <w:tc>
           <w:tcPr>
-            <w:tcW w:type="dxa" w:w="2880"/>
+            <w:tcW w:type="dxa" w:w="3120"/>
           </w:tcPr>
           <w:p>
+            <w:pPr>
+              <w:spacing w:before="40" w:after="40"/>
+            </w:pPr>
             <w:r>
               <w:rPr>
                 <w:sz w:val="19"/>
@@ -4981,9 +5719,12 @@
         </w:tc>
         <w:tc>
           <w:tcPr>
-            <w:tcW w:type="dxa" w:w="2880"/>
+            <w:tcW w:type="dxa" w:w="3120"/>
           </w:tcPr>
           <w:p>
+            <w:pPr>
+              <w:spacing w:before="40" w:after="40"/>
+            </w:pPr>
             <w:r>
               <w:rPr>
                 <w:sz w:val="19"/>
@@ -5001,9 +5742,12 @@
       <w:tr>
         <w:tc>
           <w:tcPr>
-            <w:tcW w:type="dxa" w:w="2880"/>
+            <w:tcW w:type="dxa" w:w="3120"/>
           </w:tcPr>
           <w:p>
+            <w:pPr>
+              <w:spacing w:before="40" w:after="40"/>
+            </w:pPr>
             <w:r>
               <w:rPr>
                 <w:sz w:val="19"/>
@@ -5019,9 +5763,12 @@
         </w:tc>
         <w:tc>
           <w:tcPr>
-            <w:tcW w:type="dxa" w:w="2880"/>
+            <w:tcW w:type="dxa" w:w="3120"/>
           </w:tcPr>
           <w:p>
+            <w:pPr>
+              <w:spacing w:before="40" w:after="40"/>
+            </w:pPr>
             <w:r>
               <w:rPr>
                 <w:sz w:val="19"/>
@@ -5037,9 +5784,12 @@
         </w:tc>
         <w:tc>
           <w:tcPr>
-            <w:tcW w:type="dxa" w:w="2880"/>
+            <w:tcW w:type="dxa" w:w="3120"/>
           </w:tcPr>
           <w:p>
+            <w:pPr>
+              <w:spacing w:before="40" w:after="40"/>
+            </w:pPr>
             <w:r>
               <w:rPr>
                 <w:sz w:val="19"/>
@@ -5058,7 +5808,7 @@
     <w:p/>
     <w:sectPr>
       <w:pgSz w:w="12240" w:h="15840"/>
-      <w:pgMar w:top="1440" w:right="1800" w:bottom="1440" w:left="1800" w:header="720" w:footer="720" w:gutter="0"/>
+      <w:pgMar w:top="1440" w:right="1440" w:bottom="1440" w:left="1440" w:header="720" w:footer="720" w:gutter="0"/>
       <w:cols w:space="720"/>
       <w:docGrid w:linePitch="360"/>
     </w:sectPr>
@@ -5431,6 +6181,7 @@
     <w:rsid w:val="00FC693F"/>
     <w:rPr>
       <w:rFonts w:ascii="Calibri" w:hAnsi="Calibri"/>
+      <w:color w:val="24292F"/>
       <w:sz w:val="22"/>
     </w:rPr>
   </w:style>

</xml_diff>